<commit_message>
Informe tecnico con capturas del modulo y evidencias de pruebas
Capturas del sistema en ejecucion tomadas con Playwright, resultados de
las 19 pruebas (JUnit) en la tabla de verificacion, usuarios de
desarrollo y README con la ejecucion local.
</commit_message>
<xml_diff>
--- a/docs/Informe_Tecnico_Modulo_Desembolso.docx
+++ b/docs/Informe_Tecnico_Modulo_Desembolso.docx
@@ -670,7 +670,7 @@
       <w:r>
         <w:fldChar w:fldCharType="separate"/>
       </w:r>
-      <w:hyperlink w:anchor="_Toc243340510" w:history="1">
+      <w:hyperlink w:anchor="_Toc243342832" w:history="1">
         <w:r>
           <w:rPr>
             <w:rStyle w:val="Hipervnculo"/>
@@ -698,7 +698,7 @@
             <w:noProof/>
             <w:webHidden/>
           </w:rPr>
-          <w:instrText xml:space="preserve"> PAGEREF _Toc243340510 \h </w:instrText>
+          <w:instrText xml:space="preserve"> PAGEREF _Toc243342832 \h </w:instrText>
         </w:r>
         <w:r>
           <w:rPr>
@@ -739,7 +739,7 @@
           <w:noProof/>
         </w:rPr>
       </w:pPr>
-      <w:hyperlink w:anchor="_Toc243340511" w:history="1">
+      <w:hyperlink w:anchor="_Toc243342833" w:history="1">
         <w:r>
           <w:rPr>
             <w:rStyle w:val="Hipervnculo"/>
@@ -767,7 +767,7 @@
             <w:noProof/>
             <w:webHidden/>
           </w:rPr>
-          <w:instrText xml:space="preserve"> PAGEREF _Toc243340511 \h </w:instrText>
+          <w:instrText xml:space="preserve"> PAGEREF _Toc243342833 \h </w:instrText>
         </w:r>
         <w:r>
           <w:rPr>
@@ -808,7 +808,7 @@
           <w:noProof/>
         </w:rPr>
       </w:pPr>
-      <w:hyperlink w:anchor="_Toc243340512" w:history="1">
+      <w:hyperlink w:anchor="_Toc243342834" w:history="1">
         <w:r>
           <w:rPr>
             <w:rStyle w:val="Hipervnculo"/>
@@ -836,7 +836,7 @@
             <w:noProof/>
             <w:webHidden/>
           </w:rPr>
-          <w:instrText xml:space="preserve"> PAGEREF _Toc243340512 \h </w:instrText>
+          <w:instrText xml:space="preserve"> PAGEREF _Toc243342834 \h </w:instrText>
         </w:r>
         <w:r>
           <w:rPr>
@@ -877,7 +877,7 @@
           <w:noProof/>
         </w:rPr>
       </w:pPr>
-      <w:hyperlink w:anchor="_Toc243340513" w:history="1">
+      <w:hyperlink w:anchor="_Toc243342835" w:history="1">
         <w:r>
           <w:rPr>
             <w:rStyle w:val="Hipervnculo"/>
@@ -905,7 +905,7 @@
             <w:noProof/>
             <w:webHidden/>
           </w:rPr>
-          <w:instrText xml:space="preserve"> PAGEREF _Toc243340513 \h </w:instrText>
+          <w:instrText xml:space="preserve"> PAGEREF _Toc243342835 \h </w:instrText>
         </w:r>
         <w:r>
           <w:rPr>
@@ -946,7 +946,7 @@
           <w:noProof/>
         </w:rPr>
       </w:pPr>
-      <w:hyperlink w:anchor="_Toc243340514" w:history="1">
+      <w:hyperlink w:anchor="_Toc243342836" w:history="1">
         <w:r>
           <w:rPr>
             <w:rStyle w:val="Hipervnculo"/>
@@ -974,7 +974,7 @@
             <w:noProof/>
             <w:webHidden/>
           </w:rPr>
-          <w:instrText xml:space="preserve"> PAGEREF _Toc243340514 \h </w:instrText>
+          <w:instrText xml:space="preserve"> PAGEREF _Toc243342836 \h </w:instrText>
         </w:r>
         <w:r>
           <w:rPr>
@@ -1015,7 +1015,7 @@
           <w:noProof/>
         </w:rPr>
       </w:pPr>
-      <w:hyperlink w:anchor="_Toc243340515" w:history="1">
+      <w:hyperlink w:anchor="_Toc243342837" w:history="1">
         <w:r>
           <w:rPr>
             <w:rStyle w:val="Hipervnculo"/>
@@ -1043,7 +1043,7 @@
             <w:noProof/>
             <w:webHidden/>
           </w:rPr>
-          <w:instrText xml:space="preserve"> PAGEREF _Toc243340515 \h </w:instrText>
+          <w:instrText xml:space="preserve"> PAGEREF _Toc243342837 \h </w:instrText>
         </w:r>
         <w:r>
           <w:rPr>
@@ -1084,7 +1084,7 @@
           <w:noProof/>
         </w:rPr>
       </w:pPr>
-      <w:hyperlink w:anchor="_Toc243340516" w:history="1">
+      <w:hyperlink w:anchor="_Toc243342838" w:history="1">
         <w:r>
           <w:rPr>
             <w:rStyle w:val="Hipervnculo"/>
@@ -1112,7 +1112,7 @@
             <w:noProof/>
             <w:webHidden/>
           </w:rPr>
-          <w:instrText xml:space="preserve"> PAGEREF _Toc243340516 \h </w:instrText>
+          <w:instrText xml:space="preserve"> PAGEREF _Toc243342838 \h </w:instrText>
         </w:r>
         <w:r>
           <w:rPr>
@@ -1153,7 +1153,7 @@
           <w:noProof/>
         </w:rPr>
       </w:pPr>
-      <w:hyperlink w:anchor="_Toc243340517" w:history="1">
+      <w:hyperlink w:anchor="_Toc243342839" w:history="1">
         <w:r>
           <w:rPr>
             <w:rStyle w:val="Hipervnculo"/>
@@ -1181,7 +1181,7 @@
             <w:noProof/>
             <w:webHidden/>
           </w:rPr>
-          <w:instrText xml:space="preserve"> PAGEREF _Toc243340517 \h </w:instrText>
+          <w:instrText xml:space="preserve"> PAGEREF _Toc243342839 \h </w:instrText>
         </w:r>
         <w:r>
           <w:rPr>
@@ -1222,7 +1222,7 @@
           <w:noProof/>
         </w:rPr>
       </w:pPr>
-      <w:hyperlink w:anchor="_Toc243340518" w:history="1">
+      <w:hyperlink w:anchor="_Toc243342840" w:history="1">
         <w:r>
           <w:rPr>
             <w:rStyle w:val="Hipervnculo"/>
@@ -1250,7 +1250,7 @@
             <w:noProof/>
             <w:webHidden/>
           </w:rPr>
-          <w:instrText xml:space="preserve"> PAGEREF _Toc243340518 \h </w:instrText>
+          <w:instrText xml:space="preserve"> PAGEREF _Toc243342840 \h </w:instrText>
         </w:r>
         <w:r>
           <w:rPr>
@@ -1291,7 +1291,7 @@
           <w:noProof/>
         </w:rPr>
       </w:pPr>
-      <w:hyperlink w:anchor="_Toc243340519" w:history="1">
+      <w:hyperlink w:anchor="_Toc243342841" w:history="1">
         <w:r>
           <w:rPr>
             <w:rStyle w:val="Hipervnculo"/>
@@ -1319,7 +1319,7 @@
             <w:noProof/>
             <w:webHidden/>
           </w:rPr>
-          <w:instrText xml:space="preserve"> PAGEREF _Toc243340519 \h </w:instrText>
+          <w:instrText xml:space="preserve"> PAGEREF _Toc243342841 \h </w:instrText>
         </w:r>
         <w:r>
           <w:rPr>
@@ -1360,7 +1360,7 @@
           <w:noProof/>
         </w:rPr>
       </w:pPr>
-      <w:hyperlink w:anchor="_Toc243340520" w:history="1">
+      <w:hyperlink w:anchor="_Toc243342842" w:history="1">
         <w:r>
           <w:rPr>
             <w:rStyle w:val="Hipervnculo"/>
@@ -1388,7 +1388,7 @@
             <w:noProof/>
             <w:webHidden/>
           </w:rPr>
-          <w:instrText xml:space="preserve"> PAGEREF _Toc243340520 \h </w:instrText>
+          <w:instrText xml:space="preserve"> PAGEREF _Toc243342842 \h </w:instrText>
         </w:r>
         <w:r>
           <w:rPr>
@@ -1429,7 +1429,7 @@
           <w:noProof/>
         </w:rPr>
       </w:pPr>
-      <w:hyperlink w:anchor="_Toc243340521" w:history="1">
+      <w:hyperlink w:anchor="_Toc243342843" w:history="1">
         <w:r>
           <w:rPr>
             <w:rStyle w:val="Hipervnculo"/>
@@ -1457,7 +1457,7 @@
             <w:noProof/>
             <w:webHidden/>
           </w:rPr>
-          <w:instrText xml:space="preserve"> PAGEREF _Toc243340521 \h </w:instrText>
+          <w:instrText xml:space="preserve"> PAGEREF _Toc243342843 \h </w:instrText>
         </w:r>
         <w:r>
           <w:rPr>
@@ -1498,7 +1498,7 @@
           <w:noProof/>
         </w:rPr>
       </w:pPr>
-      <w:hyperlink w:anchor="_Toc243340522" w:history="1">
+      <w:hyperlink w:anchor="_Toc243342844" w:history="1">
         <w:r>
           <w:rPr>
             <w:rStyle w:val="Hipervnculo"/>
@@ -1526,7 +1526,7 @@
             <w:noProof/>
             <w:webHidden/>
           </w:rPr>
-          <w:instrText xml:space="preserve"> PAGEREF _Toc243340522 \h </w:instrText>
+          <w:instrText xml:space="preserve"> PAGEREF _Toc243342844 \h </w:instrText>
         </w:r>
         <w:r>
           <w:rPr>
@@ -1567,7 +1567,7 @@
           <w:noProof/>
         </w:rPr>
       </w:pPr>
-      <w:hyperlink w:anchor="_Toc243340523" w:history="1">
+      <w:hyperlink w:anchor="_Toc243342845" w:history="1">
         <w:r>
           <w:rPr>
             <w:rStyle w:val="Hipervnculo"/>
@@ -1595,7 +1595,7 @@
             <w:noProof/>
             <w:webHidden/>
           </w:rPr>
-          <w:instrText xml:space="preserve"> PAGEREF _Toc243340523 \h </w:instrText>
+          <w:instrText xml:space="preserve"> PAGEREF _Toc243342845 \h </w:instrText>
         </w:r>
         <w:r>
           <w:rPr>
@@ -1636,7 +1636,7 @@
           <w:noProof/>
         </w:rPr>
       </w:pPr>
-      <w:hyperlink w:anchor="_Toc243340524" w:history="1">
+      <w:hyperlink w:anchor="_Toc243342846" w:history="1">
         <w:r>
           <w:rPr>
             <w:rStyle w:val="Hipervnculo"/>
@@ -1664,7 +1664,7 @@
             <w:noProof/>
             <w:webHidden/>
           </w:rPr>
-          <w:instrText xml:space="preserve"> PAGEREF _Toc243340524 \h </w:instrText>
+          <w:instrText xml:space="preserve"> PAGEREF _Toc243342846 \h </w:instrText>
         </w:r>
         <w:r>
           <w:rPr>
@@ -1705,7 +1705,7 @@
           <w:noProof/>
         </w:rPr>
       </w:pPr>
-      <w:hyperlink w:anchor="_Toc243340525" w:history="1">
+      <w:hyperlink w:anchor="_Toc243342847" w:history="1">
         <w:r>
           <w:rPr>
             <w:rStyle w:val="Hipervnculo"/>
@@ -1733,7 +1733,7 @@
             <w:noProof/>
             <w:webHidden/>
           </w:rPr>
-          <w:instrText xml:space="preserve"> PAGEREF _Toc243340525 \h </w:instrText>
+          <w:instrText xml:space="preserve"> PAGEREF _Toc243342847 \h </w:instrText>
         </w:r>
         <w:r>
           <w:rPr>
@@ -1774,7 +1774,7 @@
           <w:noProof/>
         </w:rPr>
       </w:pPr>
-      <w:hyperlink w:anchor="_Toc243340526" w:history="1">
+      <w:hyperlink w:anchor="_Toc243342848" w:history="1">
         <w:r>
           <w:rPr>
             <w:rStyle w:val="Hipervnculo"/>
@@ -1802,7 +1802,7 @@
             <w:noProof/>
             <w:webHidden/>
           </w:rPr>
-          <w:instrText xml:space="preserve"> PAGEREF _Toc243340526 \h </w:instrText>
+          <w:instrText xml:space="preserve"> PAGEREF _Toc243342848 \h </w:instrText>
         </w:r>
         <w:r>
           <w:rPr>
@@ -1843,7 +1843,7 @@
           <w:noProof/>
         </w:rPr>
       </w:pPr>
-      <w:hyperlink w:anchor="_Toc243340527" w:history="1">
+      <w:hyperlink w:anchor="_Toc243342849" w:history="1">
         <w:r>
           <w:rPr>
             <w:rStyle w:val="Hipervnculo"/>
@@ -1871,7 +1871,7 @@
             <w:noProof/>
             <w:webHidden/>
           </w:rPr>
-          <w:instrText xml:space="preserve"> PAGEREF _Toc243340527 \h </w:instrText>
+          <w:instrText xml:space="preserve"> PAGEREF _Toc243342849 \h </w:instrText>
         </w:r>
         <w:r>
           <w:rPr>
@@ -1912,7 +1912,7 @@
           <w:noProof/>
         </w:rPr>
       </w:pPr>
-      <w:hyperlink w:anchor="_Toc243340528" w:history="1">
+      <w:hyperlink w:anchor="_Toc243342850" w:history="1">
         <w:r>
           <w:rPr>
             <w:rStyle w:val="Hipervnculo"/>
@@ -1940,7 +1940,7 @@
             <w:noProof/>
             <w:webHidden/>
           </w:rPr>
-          <w:instrText xml:space="preserve"> PAGEREF _Toc243340528 \h </w:instrText>
+          <w:instrText xml:space="preserve"> PAGEREF _Toc243342850 \h </w:instrText>
         </w:r>
         <w:r>
           <w:rPr>
@@ -1981,7 +1981,7 @@
           <w:noProof/>
         </w:rPr>
       </w:pPr>
-      <w:hyperlink w:anchor="_Toc243340529" w:history="1">
+      <w:hyperlink w:anchor="_Toc243342851" w:history="1">
         <w:r>
           <w:rPr>
             <w:rStyle w:val="Hipervnculo"/>
@@ -2009,7 +2009,7 @@
             <w:noProof/>
             <w:webHidden/>
           </w:rPr>
-          <w:instrText xml:space="preserve"> PAGEREF _Toc243340529 \h </w:instrText>
+          <w:instrText xml:space="preserve"> PAGEREF _Toc243342851 \h </w:instrText>
         </w:r>
         <w:r>
           <w:rPr>
@@ -2050,7 +2050,7 @@
           <w:noProof/>
         </w:rPr>
       </w:pPr>
-      <w:hyperlink w:anchor="_Toc243340530" w:history="1">
+      <w:hyperlink w:anchor="_Toc243342852" w:history="1">
         <w:r>
           <w:rPr>
             <w:rStyle w:val="Hipervnculo"/>
@@ -2078,7 +2078,7 @@
             <w:noProof/>
             <w:webHidden/>
           </w:rPr>
-          <w:instrText xml:space="preserve"> PAGEREF _Toc243340530 \h </w:instrText>
+          <w:instrText xml:space="preserve"> PAGEREF _Toc243342852 \h </w:instrText>
         </w:r>
         <w:r>
           <w:rPr>
@@ -2119,7 +2119,7 @@
           <w:noProof/>
         </w:rPr>
       </w:pPr>
-      <w:hyperlink w:anchor="_Toc243340531" w:history="1">
+      <w:hyperlink w:anchor="_Toc243342853" w:history="1">
         <w:r>
           <w:rPr>
             <w:rStyle w:val="Hipervnculo"/>
@@ -2147,7 +2147,7 @@
             <w:noProof/>
             <w:webHidden/>
           </w:rPr>
-          <w:instrText xml:space="preserve"> PAGEREF _Toc243340531 \h </w:instrText>
+          <w:instrText xml:space="preserve"> PAGEREF _Toc243342853 \h </w:instrText>
         </w:r>
         <w:r>
           <w:rPr>
@@ -2188,7 +2188,7 @@
           <w:noProof/>
         </w:rPr>
       </w:pPr>
-      <w:hyperlink w:anchor="_Toc243340532" w:history="1">
+      <w:hyperlink w:anchor="_Toc243342854" w:history="1">
         <w:r>
           <w:rPr>
             <w:rStyle w:val="Hipervnculo"/>
@@ -2216,7 +2216,7 @@
             <w:noProof/>
             <w:webHidden/>
           </w:rPr>
-          <w:instrText xml:space="preserve"> PAGEREF _Toc243340532 \h </w:instrText>
+          <w:instrText xml:space="preserve"> PAGEREF _Toc243342854 \h </w:instrText>
         </w:r>
         <w:r>
           <w:rPr>
@@ -2257,7 +2257,7 @@
           <w:noProof/>
         </w:rPr>
       </w:pPr>
-      <w:hyperlink w:anchor="_Toc243340533" w:history="1">
+      <w:hyperlink w:anchor="_Toc243342855" w:history="1">
         <w:r>
           <w:rPr>
             <w:rStyle w:val="Hipervnculo"/>
@@ -2285,7 +2285,7 @@
             <w:noProof/>
             <w:webHidden/>
           </w:rPr>
-          <w:instrText xml:space="preserve"> PAGEREF _Toc243340533 \h </w:instrText>
+          <w:instrText xml:space="preserve"> PAGEREF _Toc243342855 \h </w:instrText>
         </w:r>
         <w:r>
           <w:rPr>
@@ -2326,7 +2326,7 @@
           <w:noProof/>
         </w:rPr>
       </w:pPr>
-      <w:hyperlink w:anchor="_Toc243340534" w:history="1">
+      <w:hyperlink w:anchor="_Toc243342856" w:history="1">
         <w:r>
           <w:rPr>
             <w:rStyle w:val="Hipervnculo"/>
@@ -2354,7 +2354,7 @@
             <w:noProof/>
             <w:webHidden/>
           </w:rPr>
-          <w:instrText xml:space="preserve"> PAGEREF _Toc243340534 \h </w:instrText>
+          <w:instrText xml:space="preserve"> PAGEREF _Toc243342856 \h </w:instrText>
         </w:r>
         <w:r>
           <w:rPr>
@@ -2395,7 +2395,7 @@
           <w:noProof/>
         </w:rPr>
       </w:pPr>
-      <w:hyperlink w:anchor="_Toc243340535" w:history="1">
+      <w:hyperlink w:anchor="_Toc243342857" w:history="1">
         <w:r>
           <w:rPr>
             <w:rStyle w:val="Hipervnculo"/>
@@ -2423,7 +2423,7 @@
             <w:noProof/>
             <w:webHidden/>
           </w:rPr>
-          <w:instrText xml:space="preserve"> PAGEREF _Toc243340535 \h </w:instrText>
+          <w:instrText xml:space="preserve"> PAGEREF _Toc243342857 \h </w:instrText>
         </w:r>
         <w:r>
           <w:rPr>
@@ -2464,7 +2464,7 @@
           <w:noProof/>
         </w:rPr>
       </w:pPr>
-      <w:hyperlink w:anchor="_Toc243340536" w:history="1">
+      <w:hyperlink w:anchor="_Toc243342858" w:history="1">
         <w:r>
           <w:rPr>
             <w:rStyle w:val="Hipervnculo"/>
@@ -2492,7 +2492,7 @@
             <w:noProof/>
             <w:webHidden/>
           </w:rPr>
-          <w:instrText xml:space="preserve"> PAGEREF _Toc243340536 \h </w:instrText>
+          <w:instrText xml:space="preserve"> PAGEREF _Toc243342858 \h </w:instrText>
         </w:r>
         <w:r>
           <w:rPr>
@@ -2533,7 +2533,7 @@
           <w:noProof/>
         </w:rPr>
       </w:pPr>
-      <w:hyperlink w:anchor="_Toc243340537" w:history="1">
+      <w:hyperlink w:anchor="_Toc243342859" w:history="1">
         <w:r>
           <w:rPr>
             <w:rStyle w:val="Hipervnculo"/>
@@ -2561,7 +2561,7 @@
             <w:noProof/>
             <w:webHidden/>
           </w:rPr>
-          <w:instrText xml:space="preserve"> PAGEREF _Toc243340537 \h </w:instrText>
+          <w:instrText xml:space="preserve"> PAGEREF _Toc243342859 \h </w:instrText>
         </w:r>
         <w:r>
           <w:rPr>
@@ -2602,7 +2602,7 @@
           <w:noProof/>
         </w:rPr>
       </w:pPr>
-      <w:hyperlink w:anchor="_Toc243340538" w:history="1">
+      <w:hyperlink w:anchor="_Toc243342860" w:history="1">
         <w:r>
           <w:rPr>
             <w:rStyle w:val="Hipervnculo"/>
@@ -2630,7 +2630,7 @@
             <w:noProof/>
             <w:webHidden/>
           </w:rPr>
-          <w:instrText xml:space="preserve"> PAGEREF _Toc243340538 \h </w:instrText>
+          <w:instrText xml:space="preserve"> PAGEREF _Toc243342860 \h </w:instrText>
         </w:r>
         <w:r>
           <w:rPr>
@@ -2671,7 +2671,7 @@
           <w:noProof/>
         </w:rPr>
       </w:pPr>
-      <w:hyperlink w:anchor="_Toc243340539" w:history="1">
+      <w:hyperlink w:anchor="_Toc243342861" w:history="1">
         <w:r>
           <w:rPr>
             <w:rStyle w:val="Hipervnculo"/>
@@ -2699,7 +2699,7 @@
             <w:noProof/>
             <w:webHidden/>
           </w:rPr>
-          <w:instrText xml:space="preserve"> PAGEREF _Toc243340539 \h </w:instrText>
+          <w:instrText xml:space="preserve"> PAGEREF _Toc243342861 \h </w:instrText>
         </w:r>
         <w:r>
           <w:rPr>
@@ -2740,7 +2740,7 @@
           <w:noProof/>
         </w:rPr>
       </w:pPr>
-      <w:hyperlink w:anchor="_Toc243340540" w:history="1">
+      <w:hyperlink w:anchor="_Toc243342862" w:history="1">
         <w:r>
           <w:rPr>
             <w:rStyle w:val="Hipervnculo"/>
@@ -2768,7 +2768,7 @@
             <w:noProof/>
             <w:webHidden/>
           </w:rPr>
-          <w:instrText xml:space="preserve"> PAGEREF _Toc243340540 \h </w:instrText>
+          <w:instrText xml:space="preserve"> PAGEREF _Toc243342862 \h </w:instrText>
         </w:r>
         <w:r>
           <w:rPr>
@@ -2809,7 +2809,7 @@
           <w:noProof/>
         </w:rPr>
       </w:pPr>
-      <w:hyperlink w:anchor="_Toc243340541" w:history="1">
+      <w:hyperlink w:anchor="_Toc243342863" w:history="1">
         <w:r>
           <w:rPr>
             <w:rStyle w:val="Hipervnculo"/>
@@ -2837,7 +2837,7 @@
             <w:noProof/>
             <w:webHidden/>
           </w:rPr>
-          <w:instrText xml:space="preserve"> PAGEREF _Toc243340541 \h </w:instrText>
+          <w:instrText xml:space="preserve"> PAGEREF _Toc243342863 \h </w:instrText>
         </w:r>
         <w:r>
           <w:rPr>
@@ -2878,7 +2878,7 @@
           <w:noProof/>
         </w:rPr>
       </w:pPr>
-      <w:hyperlink w:anchor="_Toc243340542" w:history="1">
+      <w:hyperlink w:anchor="_Toc243342864" w:history="1">
         <w:r>
           <w:rPr>
             <w:rStyle w:val="Hipervnculo"/>
@@ -2906,7 +2906,7 @@
             <w:noProof/>
             <w:webHidden/>
           </w:rPr>
-          <w:instrText xml:space="preserve"> PAGEREF _Toc243340542 \h </w:instrText>
+          <w:instrText xml:space="preserve"> PAGEREF _Toc243342864 \h </w:instrText>
         </w:r>
         <w:r>
           <w:rPr>
@@ -2947,7 +2947,7 @@
           <w:noProof/>
         </w:rPr>
       </w:pPr>
-      <w:hyperlink w:anchor="_Toc243340543" w:history="1">
+      <w:hyperlink w:anchor="_Toc243342865" w:history="1">
         <w:r>
           <w:rPr>
             <w:rStyle w:val="Hipervnculo"/>
@@ -2975,7 +2975,7 @@
             <w:noProof/>
             <w:webHidden/>
           </w:rPr>
-          <w:instrText xml:space="preserve"> PAGEREF _Toc243340543 \h </w:instrText>
+          <w:instrText xml:space="preserve"> PAGEREF _Toc243342865 \h </w:instrText>
         </w:r>
         <w:r>
           <w:rPr>
@@ -2995,7 +2995,7 @@
             <w:noProof/>
             <w:webHidden/>
           </w:rPr>
-          <w:t>21</w:t>
+          <w:t>27</w:t>
         </w:r>
         <w:r>
           <w:rPr>
@@ -3016,7 +3016,7 @@
           <w:noProof/>
         </w:rPr>
       </w:pPr>
-      <w:hyperlink w:anchor="_Toc243340544" w:history="1">
+      <w:hyperlink w:anchor="_Toc243342866" w:history="1">
         <w:r>
           <w:rPr>
             <w:rStyle w:val="Hipervnculo"/>
@@ -3044,7 +3044,7 @@
             <w:noProof/>
             <w:webHidden/>
           </w:rPr>
-          <w:instrText xml:space="preserve"> PAGEREF _Toc243340544 \h </w:instrText>
+          <w:instrText xml:space="preserve"> PAGEREF _Toc243342866 \h </w:instrText>
         </w:r>
         <w:r>
           <w:rPr>
@@ -3064,7 +3064,7 @@
             <w:noProof/>
             <w:webHidden/>
           </w:rPr>
-          <w:t>22</w:t>
+          <w:t>28</w:t>
         </w:r>
         <w:r>
           <w:rPr>
@@ -3085,7 +3085,7 @@
           <w:noProof/>
         </w:rPr>
       </w:pPr>
-      <w:hyperlink w:anchor="_Toc243340545" w:history="1">
+      <w:hyperlink w:anchor="_Toc243342867" w:history="1">
         <w:r>
           <w:rPr>
             <w:rStyle w:val="Hipervnculo"/>
@@ -3113,7 +3113,7 @@
             <w:noProof/>
             <w:webHidden/>
           </w:rPr>
-          <w:instrText xml:space="preserve"> PAGEREF _Toc243340545 \h </w:instrText>
+          <w:instrText xml:space="preserve"> PAGEREF _Toc243342867 \h </w:instrText>
         </w:r>
         <w:r>
           <w:rPr>
@@ -3133,7 +3133,7 @@
             <w:noProof/>
             <w:webHidden/>
           </w:rPr>
-          <w:t>22</w:t>
+          <w:t>29</w:t>
         </w:r>
         <w:r>
           <w:rPr>
@@ -3154,7 +3154,7 @@
           <w:noProof/>
         </w:rPr>
       </w:pPr>
-      <w:hyperlink w:anchor="_Toc243340546" w:history="1">
+      <w:hyperlink w:anchor="_Toc243342868" w:history="1">
         <w:r>
           <w:rPr>
             <w:rStyle w:val="Hipervnculo"/>
@@ -3182,7 +3182,7 @@
             <w:noProof/>
             <w:webHidden/>
           </w:rPr>
-          <w:instrText xml:space="preserve"> PAGEREF _Toc243340546 \h </w:instrText>
+          <w:instrText xml:space="preserve"> PAGEREF _Toc243342868 \h </w:instrText>
         </w:r>
         <w:r>
           <w:rPr>
@@ -3202,7 +3202,7 @@
             <w:noProof/>
             <w:webHidden/>
           </w:rPr>
-          <w:t>23</w:t>
+          <w:t>29</w:t>
         </w:r>
         <w:r>
           <w:rPr>
@@ -3223,7 +3223,7 @@
           <w:noProof/>
         </w:rPr>
       </w:pPr>
-      <w:hyperlink w:anchor="_Toc243340547" w:history="1">
+      <w:hyperlink w:anchor="_Toc243342869" w:history="1">
         <w:r>
           <w:rPr>
             <w:rStyle w:val="Hipervnculo"/>
@@ -3251,7 +3251,7 @@
             <w:noProof/>
             <w:webHidden/>
           </w:rPr>
-          <w:instrText xml:space="preserve"> PAGEREF _Toc243340547 \h </w:instrText>
+          <w:instrText xml:space="preserve"> PAGEREF _Toc243342869 \h </w:instrText>
         </w:r>
         <w:r>
           <w:rPr>
@@ -3271,7 +3271,7 @@
             <w:noProof/>
             <w:webHidden/>
           </w:rPr>
-          <w:t>24</w:t>
+          <w:t>30</w:t>
         </w:r>
         <w:r>
           <w:rPr>
@@ -3292,7 +3292,7 @@
           <w:noProof/>
         </w:rPr>
       </w:pPr>
-      <w:hyperlink w:anchor="_Toc243340548" w:history="1">
+      <w:hyperlink w:anchor="_Toc243342870" w:history="1">
         <w:r>
           <w:rPr>
             <w:rStyle w:val="Hipervnculo"/>
@@ -3320,7 +3320,7 @@
             <w:noProof/>
             <w:webHidden/>
           </w:rPr>
-          <w:instrText xml:space="preserve"> PAGEREF _Toc243340548 \h </w:instrText>
+          <w:instrText xml:space="preserve"> PAGEREF _Toc243342870 \h </w:instrText>
         </w:r>
         <w:r>
           <w:rPr>
@@ -3340,7 +3340,7 @@
             <w:noProof/>
             <w:webHidden/>
           </w:rPr>
-          <w:t>24</w:t>
+          <w:t>31</w:t>
         </w:r>
         <w:r>
           <w:rPr>
@@ -3361,7 +3361,7 @@
           <w:noProof/>
         </w:rPr>
       </w:pPr>
-      <w:hyperlink w:anchor="_Toc243340549" w:history="1">
+      <w:hyperlink w:anchor="_Toc243342871" w:history="1">
         <w:r>
           <w:rPr>
             <w:rStyle w:val="Hipervnculo"/>
@@ -3389,7 +3389,7 @@
             <w:noProof/>
             <w:webHidden/>
           </w:rPr>
-          <w:instrText xml:space="preserve"> PAGEREF _Toc243340549 \h </w:instrText>
+          <w:instrText xml:space="preserve"> PAGEREF _Toc243342871 \h </w:instrText>
         </w:r>
         <w:r>
           <w:rPr>
@@ -3409,7 +3409,7 @@
             <w:noProof/>
             <w:webHidden/>
           </w:rPr>
-          <w:t>25</w:t>
+          <w:t>31</w:t>
         </w:r>
         <w:r>
           <w:rPr>
@@ -3436,7 +3436,7 @@
         <w:spacing w:before="240" w:after="140" w:line="276" w:lineRule="auto"/>
         <w:outlineLvl w:val="0"/>
       </w:pPr>
-      <w:bookmarkStart w:id="0" w:name="_Toc243340510"/>
+      <w:bookmarkStart w:id="0" w:name="_Toc243342832"/>
       <w:r>
         <w:rPr>
           <w:b/>
@@ -4091,7 +4091,7 @@
         <w:spacing w:before="240" w:after="140" w:line="276" w:lineRule="auto"/>
         <w:outlineLvl w:val="0"/>
       </w:pPr>
-      <w:bookmarkStart w:id="1" w:name="_Toc243340511"/>
+      <w:bookmarkStart w:id="1" w:name="_Toc243342833"/>
       <w:r>
         <w:rPr>
           <w:b/>
@@ -4107,7 +4107,7 @@
         <w:spacing w:before="280" w:after="100" w:line="276" w:lineRule="auto"/>
         <w:outlineLvl w:val="1"/>
       </w:pPr>
-      <w:bookmarkStart w:id="2" w:name="_Toc243340512"/>
+      <w:bookmarkStart w:id="2" w:name="_Toc243342834"/>
       <w:r>
         <w:rPr>
           <w:b/>
@@ -4265,7 +4265,7 @@
         <w:spacing w:before="280" w:after="100" w:line="276" w:lineRule="auto"/>
         <w:outlineLvl w:val="1"/>
       </w:pPr>
-      <w:bookmarkStart w:id="3" w:name="_Toc243340513"/>
+      <w:bookmarkStart w:id="3" w:name="_Toc243342835"/>
       <w:r>
         <w:rPr>
           <w:b/>
@@ -4292,7 +4292,7 @@
         <w:spacing w:before="280" w:after="100" w:line="276" w:lineRule="auto"/>
         <w:outlineLvl w:val="1"/>
       </w:pPr>
-      <w:bookmarkStart w:id="4" w:name="_Toc243340514"/>
+      <w:bookmarkStart w:id="4" w:name="_Toc243342836"/>
       <w:r>
         <w:rPr>
           <w:b/>
@@ -4349,7 +4349,7 @@
         <w:spacing w:before="280" w:after="100" w:line="276" w:lineRule="auto"/>
         <w:outlineLvl w:val="1"/>
       </w:pPr>
-      <w:bookmarkStart w:id="5" w:name="_Toc243340515"/>
+      <w:bookmarkStart w:id="5" w:name="_Toc243342837"/>
       <w:r>
         <w:rPr>
           <w:b/>
@@ -4824,7 +4824,7 @@
         <w:spacing w:before="240" w:after="140" w:line="276" w:lineRule="auto"/>
         <w:outlineLvl w:val="0"/>
       </w:pPr>
-      <w:bookmarkStart w:id="6" w:name="_Toc243340516"/>
+      <w:bookmarkStart w:id="6" w:name="_Toc243342838"/>
       <w:r>
         <w:rPr>
           <w:b/>
@@ -5638,7 +5638,7 @@
         <w:spacing w:before="240" w:after="140" w:line="276" w:lineRule="auto"/>
         <w:outlineLvl w:val="0"/>
       </w:pPr>
-      <w:bookmarkStart w:id="7" w:name="_Toc243340517"/>
+      <w:bookmarkStart w:id="7" w:name="_Toc243342839"/>
       <w:r>
         <w:rPr>
           <w:b/>
@@ -6136,7 +6136,7 @@
         <w:spacing w:before="240" w:after="140" w:line="276" w:lineRule="auto"/>
         <w:outlineLvl w:val="0"/>
       </w:pPr>
-      <w:bookmarkStart w:id="8" w:name="_Toc243340518"/>
+      <w:bookmarkStart w:id="8" w:name="_Toc243342840"/>
       <w:r>
         <w:rPr>
           <w:b/>
@@ -7314,7 +7314,7 @@
         <w:spacing w:before="280" w:after="100" w:line="276" w:lineRule="auto"/>
         <w:outlineLvl w:val="1"/>
       </w:pPr>
-      <w:bookmarkStart w:id="9" w:name="_Toc243340519"/>
+      <w:bookmarkStart w:id="9" w:name="_Toc243342841"/>
       <w:r>
         <w:rPr>
           <w:b/>
@@ -7890,7 +7890,7 @@
         <w:spacing w:before="240" w:after="140" w:line="276" w:lineRule="auto"/>
         <w:outlineLvl w:val="0"/>
       </w:pPr>
-      <w:bookmarkStart w:id="10" w:name="_Toc243340520"/>
+      <w:bookmarkStart w:id="10" w:name="_Toc243342842"/>
       <w:r>
         <w:rPr>
           <w:b/>
@@ -10528,7 +10528,7 @@
         <w:spacing w:before="240" w:after="140" w:line="276" w:lineRule="auto"/>
         <w:outlineLvl w:val="0"/>
       </w:pPr>
-      <w:bookmarkStart w:id="11" w:name="_Toc243340521"/>
+      <w:bookmarkStart w:id="11" w:name="_Toc243342843"/>
       <w:r>
         <w:rPr>
           <w:b/>
@@ -11387,7 +11387,7 @@
         <w:spacing w:before="240" w:after="140" w:line="276" w:lineRule="auto"/>
         <w:outlineLvl w:val="0"/>
       </w:pPr>
-      <w:bookmarkStart w:id="12" w:name="_Toc243340522"/>
+      <w:bookmarkStart w:id="12" w:name="_Toc243342844"/>
       <w:r>
         <w:rPr>
           <w:b/>
@@ -12458,7 +12458,7 @@
         <w:spacing w:before="240" w:after="140" w:line="276" w:lineRule="auto"/>
         <w:outlineLvl w:val="0"/>
       </w:pPr>
-      <w:bookmarkStart w:id="13" w:name="_Toc243340523"/>
+      <w:bookmarkStart w:id="13" w:name="_Toc243342845"/>
       <w:r>
         <w:rPr>
           <w:b/>
@@ -12474,7 +12474,7 @@
         <w:spacing w:before="280" w:after="100" w:line="276" w:lineRule="auto"/>
         <w:outlineLvl w:val="1"/>
       </w:pPr>
-      <w:bookmarkStart w:id="14" w:name="_Toc243340524"/>
+      <w:bookmarkStart w:id="14" w:name="_Toc243342846"/>
       <w:r>
         <w:rPr>
           <w:b/>
@@ -13226,7 +13226,7 @@
         <w:spacing w:before="280" w:after="100" w:line="276" w:lineRule="auto"/>
         <w:outlineLvl w:val="1"/>
       </w:pPr>
-      <w:bookmarkStart w:id="15" w:name="_Toc243340525"/>
+      <w:bookmarkStart w:id="15" w:name="_Toc243342847"/>
       <w:r>
         <w:rPr>
           <w:b/>
@@ -13323,7 +13323,7 @@
         <w:spacing w:before="280" w:after="100" w:line="276" w:lineRule="auto"/>
         <w:outlineLvl w:val="1"/>
       </w:pPr>
-      <w:bookmarkStart w:id="16" w:name="_Toc243340526"/>
+      <w:bookmarkStart w:id="16" w:name="_Toc243342848"/>
       <w:r>
         <w:rPr>
           <w:b/>
@@ -13885,7 +13885,7 @@
         <w:spacing w:before="280" w:after="100" w:line="276" w:lineRule="auto"/>
         <w:outlineLvl w:val="1"/>
       </w:pPr>
-      <w:bookmarkStart w:id="17" w:name="_Toc243340527"/>
+      <w:bookmarkStart w:id="17" w:name="_Toc243342849"/>
       <w:r>
         <w:rPr>
           <w:b/>
@@ -13967,7 +13967,7 @@
         <w:spacing w:before="280" w:after="100" w:line="276" w:lineRule="auto"/>
         <w:outlineLvl w:val="1"/>
       </w:pPr>
-      <w:bookmarkStart w:id="18" w:name="_Toc243340528"/>
+      <w:bookmarkStart w:id="18" w:name="_Toc243342850"/>
       <w:r>
         <w:rPr>
           <w:b/>
@@ -14061,7 +14061,7 @@
         <w:spacing w:before="280" w:after="100" w:line="276" w:lineRule="auto"/>
         <w:outlineLvl w:val="1"/>
       </w:pPr>
-      <w:bookmarkStart w:id="19" w:name="_Toc243340529"/>
+      <w:bookmarkStart w:id="19" w:name="_Toc243342851"/>
       <w:r>
         <w:rPr>
           <w:b/>
@@ -14200,7 +14200,7 @@
         <w:spacing w:before="280" w:after="100" w:line="276" w:lineRule="auto"/>
         <w:outlineLvl w:val="1"/>
       </w:pPr>
-      <w:bookmarkStart w:id="20" w:name="_Toc243340530"/>
+      <w:bookmarkStart w:id="20" w:name="_Toc243342852"/>
       <w:r>
         <w:rPr>
           <w:b/>
@@ -14331,7 +14331,7 @@
         <w:spacing w:before="240" w:after="140" w:line="276" w:lineRule="auto"/>
         <w:outlineLvl w:val="0"/>
       </w:pPr>
-      <w:bookmarkStart w:id="21" w:name="_Toc243340531"/>
+      <w:bookmarkStart w:id="21" w:name="_Toc243342853"/>
       <w:r>
         <w:rPr>
           <w:b/>
@@ -14382,7 +14382,7 @@
         <w:spacing w:before="280" w:after="100" w:line="276" w:lineRule="auto"/>
         <w:outlineLvl w:val="1"/>
       </w:pPr>
-      <w:bookmarkStart w:id="22" w:name="_Toc243340532"/>
+      <w:bookmarkStart w:id="22" w:name="_Toc243342854"/>
       <w:r>
         <w:rPr>
           <w:b/>
@@ -15052,7 +15052,7 @@
         <w:spacing w:before="280" w:after="100" w:line="276" w:lineRule="auto"/>
         <w:outlineLvl w:val="1"/>
       </w:pPr>
-      <w:bookmarkStart w:id="23" w:name="_Toc243340533"/>
+      <w:bookmarkStart w:id="23" w:name="_Toc243342855"/>
       <w:r>
         <w:rPr>
           <w:b/>
@@ -15161,7 +15161,7 @@
         <w:spacing w:before="280" w:after="100" w:line="276" w:lineRule="auto"/>
         <w:outlineLvl w:val="1"/>
       </w:pPr>
-      <w:bookmarkStart w:id="24" w:name="_Toc243340534"/>
+      <w:bookmarkStart w:id="24" w:name="_Toc243342856"/>
       <w:r>
         <w:rPr>
           <w:b/>
@@ -15858,7 +15858,7 @@
         <w:spacing w:before="280" w:after="100" w:line="276" w:lineRule="auto"/>
         <w:outlineLvl w:val="1"/>
       </w:pPr>
-      <w:bookmarkStart w:id="25" w:name="_Toc243340535"/>
+      <w:bookmarkStart w:id="25" w:name="_Toc243342857"/>
       <w:r>
         <w:rPr>
           <w:b/>
@@ -16425,7 +16425,7 @@
         <w:spacing w:before="240" w:after="140" w:line="276" w:lineRule="auto"/>
         <w:outlineLvl w:val="0"/>
       </w:pPr>
-      <w:bookmarkStart w:id="26" w:name="_Toc243340536"/>
+      <w:bookmarkStart w:id="26" w:name="_Toc243342858"/>
       <w:r>
         <w:rPr>
           <w:b/>
@@ -16441,7 +16441,7 @@
         <w:spacing w:before="280" w:after="100" w:line="276" w:lineRule="auto"/>
         <w:outlineLvl w:val="1"/>
       </w:pPr>
-      <w:bookmarkStart w:id="27" w:name="_Toc243340537"/>
+      <w:bookmarkStart w:id="27" w:name="_Toc243342859"/>
       <w:r>
         <w:rPr>
           <w:b/>
@@ -17772,7 +17772,7 @@
         <w:spacing w:before="280" w:after="100" w:line="276" w:lineRule="auto"/>
         <w:outlineLvl w:val="1"/>
       </w:pPr>
-      <w:bookmarkStart w:id="28" w:name="_Toc243340538"/>
+      <w:bookmarkStart w:id="28" w:name="_Toc243342860"/>
       <w:r>
         <w:rPr>
           <w:b/>
@@ -18281,7 +18281,7 @@
               <w:rPr>
                 <w:sz w:val="18"/>
               </w:rPr>
-              <w:t>APROBACION_NO_HABILITADA · IDENTIDAD_RECHAZADA · CUENTA_NO_ELEGIBLE · MONEDA_DISTINTA · VALIDACIONES_INCOMPLETAS · REVALIDACION_FALLIDA</w:t>
+              <w:t>APROBACION_NO_HABILITADA · IDENTIDAD_RECHAZADA · CUENTA_NO_ELEGIBLE · MONEDA_DISTINTA · VALIDACIONES_INCOMPLETAS · VALIDACION_VENCIDA · REVALIDACION_FALLIDA</w:t>
             </w:r>
           </w:p>
         </w:tc>
@@ -18353,13 +18353,13 @@
               <w:rPr>
                 <w:sz w:val="18"/>
               </w:rPr>
-              <w:t>REVERSION_DESHABILITADA · AUTORIZADOR_IN</w:t>
+              <w:t>REVERSION_DESHABILI</w:t>
             </w:r>
             <w:r>
               <w:rPr>
                 <w:sz w:val="18"/>
               </w:rPr>
-              <w:t>VALIDO</w:t>
+              <w:t>TADA · AUTORIZADOR_INVALIDO</w:t>
             </w:r>
           </w:p>
         </w:tc>
@@ -18470,7 +18470,7 @@
         <w:spacing w:before="280" w:after="100" w:line="276" w:lineRule="auto"/>
         <w:outlineLvl w:val="1"/>
       </w:pPr>
-      <w:bookmarkStart w:id="29" w:name="_Toc243340539"/>
+      <w:bookmarkStart w:id="29" w:name="_Toc243342861"/>
       <w:r>
         <w:rPr>
           <w:b/>
@@ -18485,10 +18485,10 @@
         <w:jc w:val="both"/>
       </w:pPr>
       <w:r>
-        <w:t xml:space="preserve">Los contratos siguientes son la propuesta del equipo para cerrar CR-INT-04, </w:t>
-      </w:r>
-      <w:r>
-        <w:t>CR-INT-05 y CR-INT-06. Están implementados en el simulador del Bus y deben ratificarse con cada módulo (OBS-DES-08); cualquier cambio se tramita como solicitud de cambio (AC-45, CHG-01).</w:t>
+        <w:t xml:space="preserve">Los contratos siguientes son la propuesta del equipo para cerrar </w:t>
+      </w:r>
+      <w:r>
+        <w:t>CR-INT-04, CR-INT-05 y CR-INT-06. Están implementados en el simulador del Bus y deben ratificarse con cada módulo (OBS-DES-08); cualquier cambio se tramita como solicitud de cambio (AC-45, CHG-01).</w:t>
       </w:r>
     </w:p>
     <w:p>
@@ -19254,7 +19254,7 @@
         <w:spacing w:before="280" w:after="100" w:line="276" w:lineRule="auto"/>
         <w:outlineLvl w:val="1"/>
       </w:pPr>
-      <w:bookmarkStart w:id="30" w:name="_Toc243340540"/>
+      <w:bookmarkStart w:id="30" w:name="_Toc243342862"/>
       <w:r>
         <w:rPr>
           <w:b/>
@@ -19442,7 +19442,7 @@
         <w:spacing w:before="240" w:after="140" w:line="276" w:lineRule="auto"/>
         <w:outlineLvl w:val="0"/>
       </w:pPr>
-      <w:bookmarkStart w:id="31" w:name="_Toc243340541"/>
+      <w:bookmarkStart w:id="31" w:name="_Toc243342863"/>
       <w:r>
         <w:rPr>
           <w:b/>
@@ -19628,7 +19628,7 @@
         <w:spacing w:before="240" w:after="140" w:line="276" w:lineRule="auto"/>
         <w:outlineLvl w:val="0"/>
       </w:pPr>
-      <w:bookmarkStart w:id="32" w:name="_Toc243340542"/>
+      <w:bookmarkStart w:id="32" w:name="_Toc243342864"/>
       <w:r>
         <w:rPr>
           <w:b/>
@@ -20516,36 +20516,14 @@
     </w:p>
     <w:p>
       <w:pPr>
-        <w:keepNext/>
-        <w:spacing w:before="80" w:after="40"/>
-        <w:jc w:val="center"/>
+        <w:spacing w:after="120"/>
+        <w:jc w:val="both"/>
       </w:pPr>
       <w:r>
-        <w:rPr>
-          <w:i/>
-          <w:color w:val="7F7F7F"/>
-          <w:sz w:val="20"/>
-        </w:rPr>
-        <w:t>[Captura pendiente: 01_login.png]</w:t>
-      </w:r>
-    </w:p>
-    <w:p>
-      <w:pPr>
-        <w:spacing w:after="200"/>
-        <w:jc w:val="center"/>
-      </w:pPr>
-      <w:r>
-        <w:rPr>
-          <w:b/>
-          <w:sz w:val="20"/>
-        </w:rPr>
-        <w:t>Figura 8.</w:t>
-      </w:r>
-      <w:r>
-        <w:rPr>
-          <w:sz w:val="20"/>
-        </w:rPr>
-        <w:t xml:space="preserve"> Inicio de sesión contra el servicio de Seguridad.</w:t>
+        <w:t>Las capturas siguientes se tomaron del sist</w:t>
+      </w:r>
+      <w:r>
+        <w:t>ema en ejecución (frontend, API, MySQL 8.4 y simulador del Bus) con Playwright, recorriendo los flujos reales: desembolso completo, respuesta perdida de Cuentas, caída de Cobranza, rechazo de Cuentas e identidad rechazada. Los datos son sintéticos.</w:t>
       </w:r>
     </w:p>
     <w:p>
@@ -20556,11 +20534,44 @@
       </w:pPr>
       <w:r>
         <w:rPr>
-          <w:i/>
-          <w:color w:val="7F7F7F"/>
-          <w:sz w:val="20"/>
+          <w:noProof/>
         </w:rPr>
-        <w:t>[Captura pendiente: 02_consulta_creditos.png]</w:t>
+        <w:lastRenderedPageBreak/>
+        <w:drawing>
+          <wp:inline distT="0" distB="0" distL="0" distR="0">
+            <wp:extent cx="5580000" cy="3487500"/>
+            <wp:effectExtent l="0" t="0" r="0" b="0"/>
+            <wp:docPr id="10" name="Picture 10"/>
+            <wp:cNvGraphicFramePr>
+              <a:graphicFrameLocks xmlns:a="http://schemas.openxmlformats.org/drawingml/2006/main" noChangeAspect="1"/>
+            </wp:cNvGraphicFramePr>
+            <a:graphic xmlns:a="http://schemas.openxmlformats.org/drawingml/2006/main">
+              <a:graphicData uri="http://schemas.openxmlformats.org/drawingml/2006/picture">
+                <pic:pic xmlns:pic="http://schemas.openxmlformats.org/drawingml/2006/picture">
+                  <pic:nvPicPr>
+                    <pic:cNvPr id="0" name="01_login.png"/>
+                    <pic:cNvPicPr/>
+                  </pic:nvPicPr>
+                  <pic:blipFill>
+                    <a:blip r:embed="rId16"/>
+                    <a:stretch>
+                      <a:fillRect/>
+                    </a:stretch>
+                  </pic:blipFill>
+                  <pic:spPr>
+                    <a:xfrm>
+                      <a:off x="0" y="0"/>
+                      <a:ext cx="5580000" cy="3487500"/>
+                    </a:xfrm>
+                    <a:prstGeom prst="rect">
+                      <a:avLst/>
+                    </a:prstGeom>
+                  </pic:spPr>
+                </pic:pic>
+              </a:graphicData>
+            </a:graphic>
+          </wp:inline>
+        </w:drawing>
       </w:r>
     </w:p>
     <w:p>
@@ -20573,13 +20584,13 @@
           <w:b/>
           <w:sz w:val="20"/>
         </w:rPr>
-        <w:t>Figura 9.</w:t>
+        <w:t>Figura 8.</w:t>
       </w:r>
       <w:r>
         <w:rPr>
           <w:sz w:val="20"/>
         </w:rPr>
-        <w:t xml:space="preserve"> Pantalla 1. Consulta de créditos habilitados.</w:t>
+        <w:t xml:space="preserve"> Inicio de sesión contra el servicio de Seguridad.</w:t>
       </w:r>
     </w:p>
     <w:p>
@@ -20590,11 +20601,43 @@
       </w:pPr>
       <w:r>
         <w:rPr>
-          <w:i/>
-          <w:color w:val="7F7F7F"/>
-          <w:sz w:val="20"/>
+          <w:noProof/>
         </w:rPr>
-        <w:t>[Captura pendiente: 03_preparacion.png]</w:t>
+        <w:drawing>
+          <wp:inline distT="0" distB="0" distL="0" distR="0">
+            <wp:extent cx="5580000" cy="3487500"/>
+            <wp:effectExtent l="0" t="0" r="0" b="0"/>
+            <wp:docPr id="11" name="Picture 11"/>
+            <wp:cNvGraphicFramePr>
+              <a:graphicFrameLocks xmlns:a="http://schemas.openxmlformats.org/drawingml/2006/main" noChangeAspect="1"/>
+            </wp:cNvGraphicFramePr>
+            <a:graphic xmlns:a="http://schemas.openxmlformats.org/drawingml/2006/main">
+              <a:graphicData uri="http://schemas.openxmlformats.org/drawingml/2006/picture">
+                <pic:pic xmlns:pic="http://schemas.openxmlformats.org/drawingml/2006/picture">
+                  <pic:nvPicPr>
+                    <pic:cNvPr id="0" name="02_consulta_creditos.png"/>
+                    <pic:cNvPicPr/>
+                  </pic:nvPicPr>
+                  <pic:blipFill>
+                    <a:blip r:embed="rId17"/>
+                    <a:stretch>
+                      <a:fillRect/>
+                    </a:stretch>
+                  </pic:blipFill>
+                  <pic:spPr>
+                    <a:xfrm>
+                      <a:off x="0" y="0"/>
+                      <a:ext cx="5580000" cy="3487500"/>
+                    </a:xfrm>
+                    <a:prstGeom prst="rect">
+                      <a:avLst/>
+                    </a:prstGeom>
+                  </pic:spPr>
+                </pic:pic>
+              </a:graphicData>
+            </a:graphic>
+          </wp:inline>
+        </w:drawing>
       </w:r>
     </w:p>
     <w:p>
@@ -20607,19 +20650,13 @@
           <w:b/>
           <w:sz w:val="20"/>
         </w:rPr>
-        <w:t>Figura 10.</w:t>
+        <w:t>Figura 9.</w:t>
       </w:r>
       <w:r>
         <w:rPr>
           <w:sz w:val="20"/>
         </w:rPr>
-        <w:t xml:space="preserve"> Pantalla 2. Preparación: identidad validada</w:t>
-      </w:r>
-      <w:r>
-        <w:rPr>
-          <w:sz w:val="20"/>
-        </w:rPr>
-        <w:t xml:space="preserve"> y selección de la cuenta destino.</w:t>
+        <w:t xml:space="preserve"> Pantalla 1. Consulta de créditos habilitados.</w:t>
       </w:r>
     </w:p>
     <w:p>
@@ -20630,12 +20667,44 @@
       </w:pPr>
       <w:r>
         <w:rPr>
-          <w:i/>
-          <w:color w:val="7F7F7F"/>
-          <w:sz w:val="20"/>
+          <w:noProof/>
         </w:rPr>
         <w:lastRenderedPageBreak/>
-        <w:t>[Captura pendiente: 04_confirmacion.png]</w:t>
+        <w:drawing>
+          <wp:inline distT="0" distB="0" distL="0" distR="0">
+            <wp:extent cx="5580000" cy="5709167"/>
+            <wp:effectExtent l="0" t="0" r="0" b="0"/>
+            <wp:docPr id="12" name="Picture 12"/>
+            <wp:cNvGraphicFramePr>
+              <a:graphicFrameLocks xmlns:a="http://schemas.openxmlformats.org/drawingml/2006/main" noChangeAspect="1"/>
+            </wp:cNvGraphicFramePr>
+            <a:graphic xmlns:a="http://schemas.openxmlformats.org/drawingml/2006/main">
+              <a:graphicData uri="http://schemas.openxmlformats.org/drawingml/2006/picture">
+                <pic:pic xmlns:pic="http://schemas.openxmlformats.org/drawingml/2006/picture">
+                  <pic:nvPicPr>
+                    <pic:cNvPr id="0" name="03_preparacion.png"/>
+                    <pic:cNvPicPr/>
+                  </pic:nvPicPr>
+                  <pic:blipFill>
+                    <a:blip r:embed="rId18"/>
+                    <a:stretch>
+                      <a:fillRect/>
+                    </a:stretch>
+                  </pic:blipFill>
+                  <pic:spPr>
+                    <a:xfrm>
+                      <a:off x="0" y="0"/>
+                      <a:ext cx="5580000" cy="5709167"/>
+                    </a:xfrm>
+                    <a:prstGeom prst="rect">
+                      <a:avLst/>
+                    </a:prstGeom>
+                  </pic:spPr>
+                </pic:pic>
+              </a:graphicData>
+            </a:graphic>
+          </wp:inline>
+        </w:drawing>
       </w:r>
     </w:p>
     <w:p>
@@ -20648,13 +20717,13 @@
           <w:b/>
           <w:sz w:val="20"/>
         </w:rPr>
-        <w:t>Figura 11.</w:t>
+        <w:t>Figura 10.</w:t>
       </w:r>
       <w:r>
         <w:rPr>
           <w:sz w:val="20"/>
         </w:rPr>
-        <w:t xml:space="preserve"> Pantalla 3. Confirmación con resumen y cuenta enmascarada.</w:t>
+        <w:t xml:space="preserve"> Pantalla 2. Preparación: identidad validada y selección de la cuenta destino.</w:t>
       </w:r>
     </w:p>
     <w:p>
@@ -20665,11 +20734,44 @@
       </w:pPr>
       <w:r>
         <w:rPr>
-          <w:i/>
-          <w:color w:val="7F7F7F"/>
-          <w:sz w:val="20"/>
+          <w:noProof/>
         </w:rPr>
-        <w:t>[Captura pendiente: 05_resultado.png]</w:t>
+        <w:lastRenderedPageBreak/>
+        <w:drawing>
+          <wp:inline distT="0" distB="0" distL="0" distR="0">
+            <wp:extent cx="5580000" cy="3487500"/>
+            <wp:effectExtent l="0" t="0" r="0" b="0"/>
+            <wp:docPr id="13" name="Picture 13"/>
+            <wp:cNvGraphicFramePr>
+              <a:graphicFrameLocks xmlns:a="http://schemas.openxmlformats.org/drawingml/2006/main" noChangeAspect="1"/>
+            </wp:cNvGraphicFramePr>
+            <a:graphic xmlns:a="http://schemas.openxmlformats.org/drawingml/2006/main">
+              <a:graphicData uri="http://schemas.openxmlformats.org/drawingml/2006/picture">
+                <pic:pic xmlns:pic="http://schemas.openxmlformats.org/drawingml/2006/picture">
+                  <pic:nvPicPr>
+                    <pic:cNvPr id="0" name="04_confirmacion.png"/>
+                    <pic:cNvPicPr/>
+                  </pic:nvPicPr>
+                  <pic:blipFill>
+                    <a:blip r:embed="rId19"/>
+                    <a:stretch>
+                      <a:fillRect/>
+                    </a:stretch>
+                  </pic:blipFill>
+                  <pic:spPr>
+                    <a:xfrm>
+                      <a:off x="0" y="0"/>
+                      <a:ext cx="5580000" cy="3487500"/>
+                    </a:xfrm>
+                    <a:prstGeom prst="rect">
+                      <a:avLst/>
+                    </a:prstGeom>
+                  </pic:spPr>
+                </pic:pic>
+              </a:graphicData>
+            </a:graphic>
+          </wp:inline>
+        </w:drawing>
       </w:r>
     </w:p>
     <w:p>
@@ -20682,19 +20784,19 @@
           <w:b/>
           <w:sz w:val="20"/>
         </w:rPr>
-        <w:t>Figura 12.</w:t>
+        <w:t>Figura 11.</w:t>
       </w:r>
       <w:r>
         <w:rPr>
           <w:sz w:val="20"/>
         </w:rPr>
-        <w:t xml:space="preserve"> Pantalla 4. Resultado confirmado con operación financiera y e</w:t>
+        <w:t xml:space="preserve"> Pantalla 3. Confirmación con resum</w:t>
       </w:r>
       <w:r>
         <w:rPr>
           <w:sz w:val="20"/>
         </w:rPr>
-        <w:t>ntrega a Cobranza.</w:t>
+        <w:t>en y cuenta enmascarada.</w:t>
       </w:r>
     </w:p>
     <w:p>
@@ -20705,11 +20807,43 @@
       </w:pPr>
       <w:r>
         <w:rPr>
-          <w:i/>
-          <w:color w:val="7F7F7F"/>
-          <w:sz w:val="20"/>
+          <w:noProof/>
         </w:rPr>
-        <w:t>[Captura pendiente: 06_constancia.png]</w:t>
+        <w:drawing>
+          <wp:inline distT="0" distB="0" distL="0" distR="0">
+            <wp:extent cx="5580000" cy="3487500"/>
+            <wp:effectExtent l="0" t="0" r="0" b="0"/>
+            <wp:docPr id="14" name="Picture 14"/>
+            <wp:cNvGraphicFramePr>
+              <a:graphicFrameLocks xmlns:a="http://schemas.openxmlformats.org/drawingml/2006/main" noChangeAspect="1"/>
+            </wp:cNvGraphicFramePr>
+            <a:graphic xmlns:a="http://schemas.openxmlformats.org/drawingml/2006/main">
+              <a:graphicData uri="http://schemas.openxmlformats.org/drawingml/2006/picture">
+                <pic:pic xmlns:pic="http://schemas.openxmlformats.org/drawingml/2006/picture">
+                  <pic:nvPicPr>
+                    <pic:cNvPr id="0" name="05_resultado.png"/>
+                    <pic:cNvPicPr/>
+                  </pic:nvPicPr>
+                  <pic:blipFill>
+                    <a:blip r:embed="rId20"/>
+                    <a:stretch>
+                      <a:fillRect/>
+                    </a:stretch>
+                  </pic:blipFill>
+                  <pic:spPr>
+                    <a:xfrm>
+                      <a:off x="0" y="0"/>
+                      <a:ext cx="5580000" cy="3487500"/>
+                    </a:xfrm>
+                    <a:prstGeom prst="rect">
+                      <a:avLst/>
+                    </a:prstGeom>
+                  </pic:spPr>
+                </pic:pic>
+              </a:graphicData>
+            </a:graphic>
+          </wp:inline>
+        </w:drawing>
       </w:r>
     </w:p>
     <w:p>
@@ -20722,13 +20856,13 @@
           <w:b/>
           <w:sz w:val="20"/>
         </w:rPr>
-        <w:t>Figura 13.</w:t>
+        <w:t>Figura 12.</w:t>
       </w:r>
       <w:r>
         <w:rPr>
           <w:sz w:val="20"/>
         </w:rPr>
-        <w:t xml:space="preserve"> Constancia del desembolso.</w:t>
+        <w:t xml:space="preserve"> Pantalla 4. Resultado confirmado con operación financiera y entrega a Cobranza.</w:t>
       </w:r>
     </w:p>
     <w:p>
@@ -20739,11 +20873,44 @@
       </w:pPr>
       <w:r>
         <w:rPr>
-          <w:i/>
-          <w:color w:val="7F7F7F"/>
-          <w:sz w:val="20"/>
+          <w:noProof/>
         </w:rPr>
-        <w:t>[Captura pendiente: 07_por_verificar.png]</w:t>
+        <w:lastRenderedPageBreak/>
+        <w:drawing>
+          <wp:inline distT="0" distB="0" distL="0" distR="0">
+            <wp:extent cx="5580000" cy="3487500"/>
+            <wp:effectExtent l="0" t="0" r="0" b="0"/>
+            <wp:docPr id="15" name="Picture 15"/>
+            <wp:cNvGraphicFramePr>
+              <a:graphicFrameLocks xmlns:a="http://schemas.openxmlformats.org/drawingml/2006/main" noChangeAspect="1"/>
+            </wp:cNvGraphicFramePr>
+            <a:graphic xmlns:a="http://schemas.openxmlformats.org/drawingml/2006/main">
+              <a:graphicData uri="http://schemas.openxmlformats.org/drawingml/2006/picture">
+                <pic:pic xmlns:pic="http://schemas.openxmlformats.org/drawingml/2006/picture">
+                  <pic:nvPicPr>
+                    <pic:cNvPr id="0" name="06_constancia.png"/>
+                    <pic:cNvPicPr/>
+                  </pic:nvPicPr>
+                  <pic:blipFill>
+                    <a:blip r:embed="rId21"/>
+                    <a:stretch>
+                      <a:fillRect/>
+                    </a:stretch>
+                  </pic:blipFill>
+                  <pic:spPr>
+                    <a:xfrm>
+                      <a:off x="0" y="0"/>
+                      <a:ext cx="5580000" cy="3487500"/>
+                    </a:xfrm>
+                    <a:prstGeom prst="rect">
+                      <a:avLst/>
+                    </a:prstGeom>
+                  </pic:spPr>
+                </pic:pic>
+              </a:graphicData>
+            </a:graphic>
+          </wp:inline>
+        </w:drawing>
       </w:r>
     </w:p>
     <w:p>
@@ -20756,13 +20923,13 @@
           <w:b/>
           <w:sz w:val="20"/>
         </w:rPr>
-        <w:t>Figura 14.</w:t>
+        <w:t>Figura 13.</w:t>
       </w:r>
       <w:r>
         <w:rPr>
           <w:sz w:val="20"/>
         </w:rPr>
-        <w:t xml:space="preserve"> Resultado incierto: orden POR_VERIFICAR con opción de verificar.</w:t>
+        <w:t xml:space="preserve"> Constancia del desembolso.</w:t>
       </w:r>
     </w:p>
     <w:p>
@@ -20773,19 +20940,43 @@
       </w:pPr>
       <w:r>
         <w:rPr>
-          <w:i/>
-          <w:color w:val="7F7F7F"/>
-          <w:sz w:val="20"/>
+          <w:noProof/>
         </w:rPr>
-        <w:t>[Captura pendiente: 08_moneda_distinta.png</w:t>
-      </w:r>
-      <w:r>
-        <w:rPr>
-          <w:i/>
-          <w:color w:val="7F7F7F"/>
-          <w:sz w:val="20"/>
-        </w:rPr>
-        <w:t>]</w:t>
+        <w:drawing>
+          <wp:inline distT="0" distB="0" distL="0" distR="0">
+            <wp:extent cx="5580000" cy="3487500"/>
+            <wp:effectExtent l="0" t="0" r="0" b="0"/>
+            <wp:docPr id="16" name="Picture 16"/>
+            <wp:cNvGraphicFramePr>
+              <a:graphicFrameLocks xmlns:a="http://schemas.openxmlformats.org/drawingml/2006/main" noChangeAspect="1"/>
+            </wp:cNvGraphicFramePr>
+            <a:graphic xmlns:a="http://schemas.openxmlformats.org/drawingml/2006/main">
+              <a:graphicData uri="http://schemas.openxmlformats.org/drawingml/2006/picture">
+                <pic:pic xmlns:pic="http://schemas.openxmlformats.org/drawingml/2006/picture">
+                  <pic:nvPicPr>
+                    <pic:cNvPr id="0" name="07_por_verificar.png"/>
+                    <pic:cNvPicPr/>
+                  </pic:nvPicPr>
+                  <pic:blipFill>
+                    <a:blip r:embed="rId22"/>
+                    <a:stretch>
+                      <a:fillRect/>
+                    </a:stretch>
+                  </pic:blipFill>
+                  <pic:spPr>
+                    <a:xfrm>
+                      <a:off x="0" y="0"/>
+                      <a:ext cx="5580000" cy="3487500"/>
+                    </a:xfrm>
+                    <a:prstGeom prst="rect">
+                      <a:avLst/>
+                    </a:prstGeom>
+                  </pic:spPr>
+                </pic:pic>
+              </a:graphicData>
+            </a:graphic>
+          </wp:inline>
+        </w:drawing>
       </w:r>
     </w:p>
     <w:p>
@@ -20798,13 +20989,13 @@
           <w:b/>
           <w:sz w:val="20"/>
         </w:rPr>
-        <w:t>Figura 15.</w:t>
+        <w:t>Figura 14.</w:t>
       </w:r>
       <w:r>
         <w:rPr>
           <w:sz w:val="20"/>
         </w:rPr>
-        <w:t xml:space="preserve"> Bloqueo de una cuenta en moneda distinta a la del crédito.</w:t>
+        <w:t xml:space="preserve"> Resultado incierto: orden POR_VERIFICAR con opción de verificar.</w:t>
       </w:r>
     </w:p>
     <w:p>
@@ -20815,11 +21006,44 @@
       </w:pPr>
       <w:r>
         <w:rPr>
-          <w:i/>
-          <w:color w:val="7F7F7F"/>
-          <w:sz w:val="20"/>
+          <w:noProof/>
         </w:rPr>
-        <w:t>[Captura pendiente: 09_historial.png]</w:t>
+        <w:lastRenderedPageBreak/>
+        <w:drawing>
+          <wp:inline distT="0" distB="0" distL="0" distR="0">
+            <wp:extent cx="5580000" cy="3299558"/>
+            <wp:effectExtent l="0" t="0" r="0" b="0"/>
+            <wp:docPr id="17" name="Picture 17"/>
+            <wp:cNvGraphicFramePr>
+              <a:graphicFrameLocks xmlns:a="http://schemas.openxmlformats.org/drawingml/2006/main" noChangeAspect="1"/>
+            </wp:cNvGraphicFramePr>
+            <a:graphic xmlns:a="http://schemas.openxmlformats.org/drawingml/2006/main">
+              <a:graphicData uri="http://schemas.openxmlformats.org/drawingml/2006/picture">
+                <pic:pic xmlns:pic="http://schemas.openxmlformats.org/drawingml/2006/picture">
+                  <pic:nvPicPr>
+                    <pic:cNvPr id="0" name="08_moneda_distinta.png"/>
+                    <pic:cNvPicPr/>
+                  </pic:nvPicPr>
+                  <pic:blipFill>
+                    <a:blip r:embed="rId23"/>
+                    <a:stretch>
+                      <a:fillRect/>
+                    </a:stretch>
+                  </pic:blipFill>
+                  <pic:spPr>
+                    <a:xfrm>
+                      <a:off x="0" y="0"/>
+                      <a:ext cx="5580000" cy="3299558"/>
+                    </a:xfrm>
+                    <a:prstGeom prst="rect">
+                      <a:avLst/>
+                    </a:prstGeom>
+                  </pic:spPr>
+                </pic:pic>
+              </a:graphicData>
+            </a:graphic>
+          </wp:inline>
+        </w:drawing>
       </w:r>
     </w:p>
     <w:p>
@@ -20832,13 +21056,19 @@
           <w:b/>
           <w:sz w:val="20"/>
         </w:rPr>
-        <w:t>Figura 16.</w:t>
+        <w:t>Figura 15.</w:t>
       </w:r>
       <w:r>
         <w:rPr>
           <w:sz w:val="20"/>
         </w:rPr>
-        <w:t xml:space="preserve"> Historial de órdenes con filtros.</w:t>
+        <w:t xml:space="preserve"> Bloqueo</w:t>
+      </w:r>
+      <w:r>
+        <w:rPr>
+          <w:sz w:val="20"/>
+        </w:rPr>
+        <w:t xml:space="preserve"> de una cuenta en moneda distinta a la del crédito.</w:t>
       </w:r>
     </w:p>
     <w:p>
@@ -20849,11 +21079,43 @@
       </w:pPr>
       <w:r>
         <w:rPr>
-          <w:i/>
-          <w:color w:val="7F7F7F"/>
-          <w:sz w:val="20"/>
+          <w:noProof/>
         </w:rPr>
-        <w:t>[Captura pendiente: 10_detalle_auditoria.png]</w:t>
+        <w:drawing>
+          <wp:inline distT="0" distB="0" distL="0" distR="0">
+            <wp:extent cx="5580000" cy="3487500"/>
+            <wp:effectExtent l="0" t="0" r="0" b="0"/>
+            <wp:docPr id="18" name="Picture 18"/>
+            <wp:cNvGraphicFramePr>
+              <a:graphicFrameLocks xmlns:a="http://schemas.openxmlformats.org/drawingml/2006/main" noChangeAspect="1"/>
+            </wp:cNvGraphicFramePr>
+            <a:graphic xmlns:a="http://schemas.openxmlformats.org/drawingml/2006/main">
+              <a:graphicData uri="http://schemas.openxmlformats.org/drawingml/2006/picture">
+                <pic:pic xmlns:pic="http://schemas.openxmlformats.org/drawingml/2006/picture">
+                  <pic:nvPicPr>
+                    <pic:cNvPr id="0" name="09_historial.png"/>
+                    <pic:cNvPicPr/>
+                  </pic:nvPicPr>
+                  <pic:blipFill>
+                    <a:blip r:embed="rId24"/>
+                    <a:stretch>
+                      <a:fillRect/>
+                    </a:stretch>
+                  </pic:blipFill>
+                  <pic:spPr>
+                    <a:xfrm>
+                      <a:off x="0" y="0"/>
+                      <a:ext cx="5580000" cy="3487500"/>
+                    </a:xfrm>
+                    <a:prstGeom prst="rect">
+                      <a:avLst/>
+                    </a:prstGeom>
+                  </pic:spPr>
+                </pic:pic>
+              </a:graphicData>
+            </a:graphic>
+          </wp:inline>
+        </w:drawing>
       </w:r>
     </w:p>
     <w:p>
@@ -20866,19 +21128,13 @@
           <w:b/>
           <w:sz w:val="20"/>
         </w:rPr>
-        <w:t>Figura 17.</w:t>
+        <w:t>Figura 16.</w:t>
       </w:r>
       <w:r>
         <w:rPr>
           <w:sz w:val="20"/>
         </w:rPr>
-        <w:t xml:space="preserve"> Detalle de la orden con validaciones y bitác</w:t>
-      </w:r>
-      <w:r>
-        <w:rPr>
-          <w:sz w:val="20"/>
-        </w:rPr>
-        <w:t>ora.</w:t>
+        <w:t xml:space="preserve"> Historial de órdenes con filtros.</w:t>
       </w:r>
     </w:p>
     <w:p>
@@ -20889,11 +21145,44 @@
       </w:pPr>
       <w:r>
         <w:rPr>
-          <w:i/>
-          <w:color w:val="7F7F7F"/>
-          <w:sz w:val="20"/>
+          <w:noProof/>
         </w:rPr>
-        <w:t>[Captura pendiente: 11_monitor.png]</w:t>
+        <w:lastRenderedPageBreak/>
+        <w:drawing>
+          <wp:inline distT="0" distB="0" distL="0" distR="0">
+            <wp:extent cx="5580000" cy="3248961"/>
+            <wp:effectExtent l="0" t="0" r="0" b="0"/>
+            <wp:docPr id="19" name="Picture 19"/>
+            <wp:cNvGraphicFramePr>
+              <a:graphicFrameLocks xmlns:a="http://schemas.openxmlformats.org/drawingml/2006/main" noChangeAspect="1"/>
+            </wp:cNvGraphicFramePr>
+            <a:graphic xmlns:a="http://schemas.openxmlformats.org/drawingml/2006/main">
+              <a:graphicData uri="http://schemas.openxmlformats.org/drawingml/2006/picture">
+                <pic:pic xmlns:pic="http://schemas.openxmlformats.org/drawingml/2006/picture">
+                  <pic:nvPicPr>
+                    <pic:cNvPr id="0" name="10_detalle_auditoria.png"/>
+                    <pic:cNvPicPr/>
+                  </pic:nvPicPr>
+                  <pic:blipFill>
+                    <a:blip r:embed="rId25"/>
+                    <a:stretch>
+                      <a:fillRect/>
+                    </a:stretch>
+                  </pic:blipFill>
+                  <pic:spPr>
+                    <a:xfrm>
+                      <a:off x="0" y="0"/>
+                      <a:ext cx="5580000" cy="3248961"/>
+                    </a:xfrm>
+                    <a:prstGeom prst="rect">
+                      <a:avLst/>
+                    </a:prstGeom>
+                  </pic:spPr>
+                </pic:pic>
+              </a:graphicData>
+            </a:graphic>
+          </wp:inline>
+        </w:drawing>
       </w:r>
     </w:p>
     <w:p>
@@ -20906,13 +21195,13 @@
           <w:b/>
           <w:sz w:val="20"/>
         </w:rPr>
-        <w:t>Figura 18.</w:t>
+        <w:t>Figura 17.</w:t>
       </w:r>
       <w:r>
         <w:rPr>
           <w:sz w:val="20"/>
         </w:rPr>
-        <w:t xml:space="preserve"> Monitor operativo del supervisor.</w:t>
+        <w:t xml:space="preserve"> Detalle de la orden con validaciones y bitácora.</w:t>
       </w:r>
     </w:p>
     <w:p>
@@ -20923,11 +21212,43 @@
       </w:pPr>
       <w:r>
         <w:rPr>
-          <w:i/>
-          <w:color w:val="7F7F7F"/>
-          <w:sz w:val="20"/>
+          <w:noProof/>
         </w:rPr>
-        <w:t>[Captura pendiente: 12_conciliacion.png]</w:t>
+        <w:drawing>
+          <wp:inline distT="0" distB="0" distL="0" distR="0">
+            <wp:extent cx="5580000" cy="3487500"/>
+            <wp:effectExtent l="0" t="0" r="0" b="0"/>
+            <wp:docPr id="20" name="Picture 20"/>
+            <wp:cNvGraphicFramePr>
+              <a:graphicFrameLocks xmlns:a="http://schemas.openxmlformats.org/drawingml/2006/main" noChangeAspect="1"/>
+            </wp:cNvGraphicFramePr>
+            <a:graphic xmlns:a="http://schemas.openxmlformats.org/drawingml/2006/main">
+              <a:graphicData uri="http://schemas.openxmlformats.org/drawingml/2006/picture">
+                <pic:pic xmlns:pic="http://schemas.openxmlformats.org/drawingml/2006/picture">
+                  <pic:nvPicPr>
+                    <pic:cNvPr id="0" name="11_monitor.png"/>
+                    <pic:cNvPicPr/>
+                  </pic:nvPicPr>
+                  <pic:blipFill>
+                    <a:blip r:embed="rId26"/>
+                    <a:stretch>
+                      <a:fillRect/>
+                    </a:stretch>
+                  </pic:blipFill>
+                  <pic:spPr>
+                    <a:xfrm>
+                      <a:off x="0" y="0"/>
+                      <a:ext cx="5580000" cy="3487500"/>
+                    </a:xfrm>
+                    <a:prstGeom prst="rect">
+                      <a:avLst/>
+                    </a:prstGeom>
+                  </pic:spPr>
+                </pic:pic>
+              </a:graphicData>
+            </a:graphic>
+          </wp:inline>
+        </w:drawing>
       </w:r>
     </w:p>
     <w:p>
@@ -20940,13 +21261,13 @@
           <w:b/>
           <w:sz w:val="20"/>
         </w:rPr>
-        <w:t>Figura 19.</w:t>
+        <w:t>Figura 18.</w:t>
       </w:r>
       <w:r>
         <w:rPr>
           <w:sz w:val="20"/>
         </w:rPr>
-        <w:t xml:space="preserve"> Conciliación diaria contra Cuentas y Cobranza.</w:t>
+        <w:t xml:space="preserve"> Monitor operativo del supervisor.</w:t>
       </w:r>
     </w:p>
     <w:p>
@@ -20957,11 +21278,44 @@
       </w:pPr>
       <w:r>
         <w:rPr>
-          <w:i/>
-          <w:color w:val="7F7F7F"/>
-          <w:sz w:val="20"/>
+          <w:noProof/>
         </w:rPr>
-        <w:t>[Captura pendiente: 13_swagger.png]</w:t>
+        <w:lastRenderedPageBreak/>
+        <w:drawing>
+          <wp:inline distT="0" distB="0" distL="0" distR="0">
+            <wp:extent cx="5580000" cy="3487500"/>
+            <wp:effectExtent l="0" t="0" r="0" b="0"/>
+            <wp:docPr id="21" name="Picture 21"/>
+            <wp:cNvGraphicFramePr>
+              <a:graphicFrameLocks xmlns:a="http://schemas.openxmlformats.org/drawingml/2006/main" noChangeAspect="1"/>
+            </wp:cNvGraphicFramePr>
+            <a:graphic xmlns:a="http://schemas.openxmlformats.org/drawingml/2006/main">
+              <a:graphicData uri="http://schemas.openxmlformats.org/drawingml/2006/picture">
+                <pic:pic xmlns:pic="http://schemas.openxmlformats.org/drawingml/2006/picture">
+                  <pic:nvPicPr>
+                    <pic:cNvPr id="0" name="12_conciliacion.png"/>
+                    <pic:cNvPicPr/>
+                  </pic:nvPicPr>
+                  <pic:blipFill>
+                    <a:blip r:embed="rId27"/>
+                    <a:stretch>
+                      <a:fillRect/>
+                    </a:stretch>
+                  </pic:blipFill>
+                  <pic:spPr>
+                    <a:xfrm>
+                      <a:off x="0" y="0"/>
+                      <a:ext cx="5580000" cy="3487500"/>
+                    </a:xfrm>
+                    <a:prstGeom prst="rect">
+                      <a:avLst/>
+                    </a:prstGeom>
+                  </pic:spPr>
+                </pic:pic>
+              </a:graphicData>
+            </a:graphic>
+          </wp:inline>
+        </w:drawing>
       </w:r>
     </w:p>
     <w:p>
@@ -20974,19 +21328,85 @@
           <w:b/>
           <w:sz w:val="20"/>
         </w:rPr>
-        <w:t>Figura 20.</w:t>
+        <w:t>Figura 19.</w:t>
       </w:r>
       <w:r>
         <w:rPr>
           <w:sz w:val="20"/>
         </w:rPr>
-        <w:t xml:space="preserve"> Documentación OpenAPI de</w:t>
+        <w:t xml:space="preserve"> Conciliación diaria contra Cuentas </w:t>
       </w:r>
       <w:r>
         <w:rPr>
           <w:sz w:val="20"/>
         </w:rPr>
-        <w:t xml:space="preserve"> la API (Swagger UI).</w:t>
+        <w:t>y Cobranza.</w:t>
+      </w:r>
+    </w:p>
+    <w:p>
+      <w:pPr>
+        <w:keepNext/>
+        <w:spacing w:before="80" w:after="40"/>
+        <w:jc w:val="center"/>
+      </w:pPr>
+      <w:r>
+        <w:rPr>
+          <w:noProof/>
+        </w:rPr>
+        <w:drawing>
+          <wp:inline distT="0" distB="0" distL="0" distR="0">
+            <wp:extent cx="5580000" cy="3487500"/>
+            <wp:effectExtent l="0" t="0" r="0" b="0"/>
+            <wp:docPr id="22" name="Picture 22"/>
+            <wp:cNvGraphicFramePr>
+              <a:graphicFrameLocks xmlns:a="http://schemas.openxmlformats.org/drawingml/2006/main" noChangeAspect="1"/>
+            </wp:cNvGraphicFramePr>
+            <a:graphic xmlns:a="http://schemas.openxmlformats.org/drawingml/2006/main">
+              <a:graphicData uri="http://schemas.openxmlformats.org/drawingml/2006/picture">
+                <pic:pic xmlns:pic="http://schemas.openxmlformats.org/drawingml/2006/picture">
+                  <pic:nvPicPr>
+                    <pic:cNvPr id="0" name="13_swagger.png"/>
+                    <pic:cNvPicPr/>
+                  </pic:nvPicPr>
+                  <pic:blipFill>
+                    <a:blip r:embed="rId28"/>
+                    <a:stretch>
+                      <a:fillRect/>
+                    </a:stretch>
+                  </pic:blipFill>
+                  <pic:spPr>
+                    <a:xfrm>
+                      <a:off x="0" y="0"/>
+                      <a:ext cx="5580000" cy="3487500"/>
+                    </a:xfrm>
+                    <a:prstGeom prst="rect">
+                      <a:avLst/>
+                    </a:prstGeom>
+                  </pic:spPr>
+                </pic:pic>
+              </a:graphicData>
+            </a:graphic>
+          </wp:inline>
+        </w:drawing>
+      </w:r>
+    </w:p>
+    <w:p>
+      <w:pPr>
+        <w:spacing w:after="200"/>
+        <w:jc w:val="center"/>
+      </w:pPr>
+      <w:r>
+        <w:rPr>
+          <w:b/>
+          <w:sz w:val="20"/>
+        </w:rPr>
+        <w:t>Figura 20.</w:t>
+      </w:r>
+      <w:r>
+        <w:rPr>
+          <w:sz w:val="20"/>
+        </w:rPr>
+        <w:t xml:space="preserve"> Documentación OpenAPI de la API (Swagger UI).</w:t>
       </w:r>
     </w:p>
     <w:p>
@@ -20995,7 +21415,7 @@
         <w:spacing w:before="240" w:after="140" w:line="276" w:lineRule="auto"/>
         <w:outlineLvl w:val="0"/>
       </w:pPr>
-      <w:bookmarkStart w:id="33" w:name="_Toc243340543"/>
+      <w:bookmarkStart w:id="33" w:name="_Toc243342865"/>
       <w:r>
         <w:rPr>
           <w:b/>
@@ -21237,7 +21657,13 @@
               <w:rPr>
                 <w:sz w:val="20"/>
               </w:rPr>
-              <w:t>MySQL 8.4 (InnoDB, utf8mb4) · SQLAlchemy 2.0 · PyMySQL</w:t>
+              <w:t xml:space="preserve">MySQL 8.4 </w:t>
+            </w:r>
+            <w:r>
+              <w:rPr>
+                <w:sz w:val="20"/>
+              </w:rPr>
+              <w:t>(InnoDB, utf8mb4) · SQLAlchemy 2.0 · PyMySQL</w:t>
             </w:r>
           </w:p>
         </w:tc>
@@ -21299,6 +21725,7 @@
               <w:rPr>
                 <w:sz w:val="20"/>
               </w:rPr>
+              <w:lastRenderedPageBreak/>
               <w:t>Validación y configuración</w:t>
             </w:r>
           </w:p>
@@ -21414,7 +21841,13 @@
               <w:rPr>
                 <w:sz w:val="20"/>
               </w:rPr>
-              <w:t>Llamadas REST al Bus con tiempos de espera y correlación.</w:t>
+              <w:t xml:space="preserve">Llamadas REST al Bus </w:t>
+            </w:r>
+            <w:r>
+              <w:rPr>
+                <w:sz w:val="20"/>
+              </w:rPr>
+              <w:t>con tiempos de espera y correlación.</w:t>
             </w:r>
           </w:p>
         </w:tc>
@@ -21441,13 +21874,7 @@
               <w:rPr>
                 <w:sz w:val="20"/>
               </w:rPr>
-              <w:t>Segurid</w:t>
-            </w:r>
-            <w:r>
-              <w:rPr>
-                <w:sz w:val="20"/>
-              </w:rPr>
-              <w:t>ad</w:t>
+              <w:t>Seguridad</w:t>
             </w:r>
           </w:p>
         </w:tc>
@@ -21611,7 +22038,13 @@
               <w:rPr>
                 <w:sz w:val="20"/>
               </w:rPr>
-              <w:t>Tailwind CSS 4 · React Hook Form · Zod</w:t>
+              <w:t xml:space="preserve">Tailwind CSS 4 · </w:t>
+            </w:r>
+            <w:r>
+              <w:rPr>
+                <w:sz w:val="20"/>
+              </w:rPr>
+              <w:t>React Hook Form · Zod</w:t>
             </w:r>
           </w:p>
         </w:tc>
@@ -21633,13 +22066,7 @@
               <w:rPr>
                 <w:sz w:val="20"/>
               </w:rPr>
-              <w:t xml:space="preserve">Diseño responsivo y </w:t>
-            </w:r>
-            <w:r>
-              <w:rPr>
-                <w:sz w:val="20"/>
-              </w:rPr>
-              <w:t>validación tipada en el cliente.</w:t>
+              <w:t>Diseño responsivo y validación tipada en el cliente.</w:t>
             </w:r>
           </w:p>
         </w:tc>
@@ -21781,7 +22208,13 @@
               <w:rPr>
                 <w:sz w:val="20"/>
               </w:rPr>
-              <w:t>Pruebas de reglas e integración; capturas del informe.</w:t>
+              <w:t>Pruebas de reglas e i</w:t>
+            </w:r>
+            <w:r>
+              <w:rPr>
+                <w:sz w:val="20"/>
+              </w:rPr>
+              <w:t>ntegración; capturas del informe.</w:t>
             </w:r>
           </w:p>
         </w:tc>
@@ -21808,13 +22241,7 @@
               <w:rPr>
                 <w:sz w:val="20"/>
               </w:rPr>
-              <w:t>Documen</w:t>
-            </w:r>
-            <w:r>
-              <w:rPr>
-                <w:sz w:val="20"/>
-              </w:rPr>
-              <w:t>tación</w:t>
+              <w:t>Documentación</w:t>
             </w:r>
           </w:p>
         </w:tc>
@@ -21876,13 +22303,12 @@
         <w:spacing w:before="240" w:after="140" w:line="276" w:lineRule="auto"/>
         <w:outlineLvl w:val="0"/>
       </w:pPr>
-      <w:bookmarkStart w:id="34" w:name="_Toc243340544"/>
+      <w:bookmarkStart w:id="34" w:name="_Toc243342866"/>
       <w:r>
         <w:rPr>
           <w:b/>
           <w:sz w:val="28"/>
         </w:rPr>
-        <w:lastRenderedPageBreak/>
         <w:t>15. Repositorio, ambientes y ejecución</w:t>
       </w:r>
       <w:bookmarkEnd w:id="34"/>
@@ -21895,7 +22321,7 @@
       <w:r>
         <w:t xml:space="preserve">Repositorio: </w:t>
       </w:r>
-      <w:hyperlink r:id="rId16">
+      <w:hyperlink r:id="rId29">
         <w:r>
           <w:rPr>
             <w:color w:val="0563C1"/>
@@ -22703,6 +23129,350 @@
         <w:rPr>
           <w:sz w:val="20"/>
         </w:rPr>
+        <w:t xml:space="preserve"> Usuarios del simulador de Seguridad (solo desarrollo; contraseña Demo2026!)</w:t>
+      </w:r>
+    </w:p>
+    <w:tbl>
+      <w:tblPr>
+        <w:tblStyle w:val="Tablaconcuadrcula"/>
+        <w:tblW w:w="9292" w:type="dxa"/>
+        <w:tblBorders>
+          <w:top w:val="single" w:sz="4" w:space="0" w:color="000000"/>
+          <w:left w:val="single" w:sz="4" w:space="0" w:color="000000"/>
+          <w:bottom w:val="single" w:sz="4" w:space="0" w:color="000000"/>
+          <w:right w:val="single" w:sz="4" w:space="0" w:color="000000"/>
+          <w:insideH w:val="single" w:sz="4" w:space="0" w:color="000000"/>
+          <w:insideV w:val="single" w:sz="4" w:space="0" w:color="000000"/>
+        </w:tblBorders>
+        <w:tblLayout w:type="fixed"/>
+        <w:tblLook w:val="04A0" w:firstRow="1" w:lastRow="0" w:firstColumn="1" w:lastColumn="0" w:noHBand="0" w:noVBand="1"/>
+      </w:tblPr>
+      <w:tblGrid>
+        <w:gridCol w:w="2493"/>
+        <w:gridCol w:w="2266"/>
+        <w:gridCol w:w="4533"/>
+      </w:tblGrid>
+      <w:tr>
+        <w:trPr>
+          <w:cantSplit/>
+          <w:tblHeader/>
+        </w:trPr>
+        <w:tc>
+          <w:tcPr>
+            <w:tcW w:w="2493" w:type="dxa"/>
+            <w:shd w:val="clear" w:color="auto" w:fill="D9D9D9"/>
+            <w:tcMar>
+              <w:top w:w="50" w:type="dxa"/>
+              <w:left w:w="80" w:type="dxa"/>
+              <w:bottom w:w="50" w:type="dxa"/>
+              <w:right w:w="80" w:type="dxa"/>
+            </w:tcMar>
+          </w:tcPr>
+          <w:p>
+            <w:pPr>
+              <w:spacing w:after="20"/>
+            </w:pPr>
+            <w:r>
+              <w:rPr>
+                <w:b/>
+                <w:sz w:val="20"/>
+              </w:rPr>
+              <w:t>Usuario</w:t>
+            </w:r>
+          </w:p>
+        </w:tc>
+        <w:tc>
+          <w:tcPr>
+            <w:tcW w:w="2266" w:type="dxa"/>
+            <w:shd w:val="clear" w:color="auto" w:fill="D9D9D9"/>
+            <w:tcMar>
+              <w:top w:w="50" w:type="dxa"/>
+              <w:left w:w="80" w:type="dxa"/>
+              <w:bottom w:w="50" w:type="dxa"/>
+              <w:right w:w="80" w:type="dxa"/>
+            </w:tcMar>
+          </w:tcPr>
+          <w:p>
+            <w:pPr>
+              <w:spacing w:after="20"/>
+            </w:pPr>
+            <w:r>
+              <w:rPr>
+                <w:b/>
+                <w:sz w:val="20"/>
+              </w:rPr>
+              <w:t>Rol</w:t>
+            </w:r>
+          </w:p>
+        </w:tc>
+        <w:tc>
+          <w:tcPr>
+            <w:tcW w:w="4533" w:type="dxa"/>
+            <w:shd w:val="clear" w:color="auto" w:fill="D9D9D9"/>
+            <w:tcMar>
+              <w:top w:w="50" w:type="dxa"/>
+              <w:left w:w="80" w:type="dxa"/>
+              <w:bottom w:w="50" w:type="dxa"/>
+              <w:right w:w="80" w:type="dxa"/>
+            </w:tcMar>
+          </w:tcPr>
+          <w:p>
+            <w:pPr>
+              <w:spacing w:after="20"/>
+            </w:pPr>
+            <w:r>
+              <w:rPr>
+                <w:b/>
+                <w:sz w:val="20"/>
+              </w:rPr>
+              <w:t>Uso</w:t>
+            </w:r>
+          </w:p>
+        </w:tc>
+      </w:tr>
+      <w:tr>
+        <w:trPr>
+          <w:cantSplit/>
+        </w:trPr>
+        <w:tc>
+          <w:tcPr>
+            <w:tcW w:w="2493" w:type="dxa"/>
+            <w:tcMar>
+              <w:top w:w="50" w:type="dxa"/>
+              <w:left w:w="80" w:type="dxa"/>
+              <w:bottom w:w="50" w:type="dxa"/>
+              <w:right w:w="80" w:type="dxa"/>
+            </w:tcMar>
+          </w:tcPr>
+          <w:p>
+            <w:pPr>
+              <w:spacing w:after="20"/>
+            </w:pPr>
+            <w:r>
+              <w:rPr>
+                <w:sz w:val="20"/>
+              </w:rPr>
+              <w:t>operador1 · operador2</w:t>
+            </w:r>
+          </w:p>
+        </w:tc>
+        <w:tc>
+          <w:tcPr>
+            <w:tcW w:w="2266" w:type="dxa"/>
+            <w:tcMar>
+              <w:top w:w="50" w:type="dxa"/>
+              <w:left w:w="80" w:type="dxa"/>
+              <w:bottom w:w="50" w:type="dxa"/>
+              <w:right w:w="80" w:type="dxa"/>
+            </w:tcMar>
+          </w:tcPr>
+          <w:p>
+            <w:pPr>
+              <w:spacing w:after="20"/>
+            </w:pPr>
+            <w:r>
+              <w:rPr>
+                <w:sz w:val="20"/>
+              </w:rPr>
+              <w:t>OPERADOR_AGENCIA</w:t>
+            </w:r>
+          </w:p>
+        </w:tc>
+        <w:tc>
+          <w:tcPr>
+            <w:tcW w:w="4533" w:type="dxa"/>
+            <w:tcMar>
+              <w:top w:w="50" w:type="dxa"/>
+              <w:left w:w="80" w:type="dxa"/>
+              <w:bottom w:w="50" w:type="dxa"/>
+              <w:right w:w="80" w:type="dxa"/>
+            </w:tcMar>
+          </w:tcPr>
+          <w:p>
+            <w:pPr>
+              <w:spacing w:after="20"/>
+            </w:pPr>
+            <w:r>
+              <w:rPr>
+                <w:sz w:val="20"/>
+              </w:rPr>
+              <w:t xml:space="preserve">Preparar, validar, confirmar y </w:t>
+            </w:r>
+            <w:r>
+              <w:rPr>
+                <w:sz w:val="20"/>
+              </w:rPr>
+              <w:t>consultar.</w:t>
+            </w:r>
+          </w:p>
+        </w:tc>
+      </w:tr>
+      <w:tr>
+        <w:trPr>
+          <w:cantSplit/>
+        </w:trPr>
+        <w:tc>
+          <w:tcPr>
+            <w:tcW w:w="2493" w:type="dxa"/>
+            <w:tcMar>
+              <w:top w:w="50" w:type="dxa"/>
+              <w:left w:w="80" w:type="dxa"/>
+              <w:bottom w:w="50" w:type="dxa"/>
+              <w:right w:w="80" w:type="dxa"/>
+            </w:tcMar>
+          </w:tcPr>
+          <w:p>
+            <w:pPr>
+              <w:spacing w:after="20"/>
+            </w:pPr>
+            <w:r>
+              <w:rPr>
+                <w:sz w:val="20"/>
+              </w:rPr>
+              <w:lastRenderedPageBreak/>
+              <w:t>supervisor1 · supervisor2</w:t>
+            </w:r>
+          </w:p>
+        </w:tc>
+        <w:tc>
+          <w:tcPr>
+            <w:tcW w:w="2266" w:type="dxa"/>
+            <w:tcMar>
+              <w:top w:w="50" w:type="dxa"/>
+              <w:left w:w="80" w:type="dxa"/>
+              <w:bottom w:w="50" w:type="dxa"/>
+              <w:right w:w="80" w:type="dxa"/>
+            </w:tcMar>
+          </w:tcPr>
+          <w:p>
+            <w:pPr>
+              <w:spacing w:after="20"/>
+            </w:pPr>
+            <w:r>
+              <w:rPr>
+                <w:sz w:val="20"/>
+              </w:rPr>
+              <w:t>SUPERVISOR</w:t>
+            </w:r>
+          </w:p>
+        </w:tc>
+        <w:tc>
+          <w:tcPr>
+            <w:tcW w:w="4533" w:type="dxa"/>
+            <w:tcMar>
+              <w:top w:w="50" w:type="dxa"/>
+              <w:left w:w="80" w:type="dxa"/>
+              <w:bottom w:w="50" w:type="dxa"/>
+              <w:right w:w="80" w:type="dxa"/>
+            </w:tcMar>
+          </w:tcPr>
+          <w:p>
+            <w:pPr>
+              <w:spacing w:after="20"/>
+            </w:pPr>
+            <w:r>
+              <w:rPr>
+                <w:sz w:val="20"/>
+              </w:rPr>
+              <w:t>Monitor, conciliación, reintentos y decisión de reversiones (cuatro ojos).</w:t>
+            </w:r>
+          </w:p>
+        </w:tc>
+      </w:tr>
+      <w:tr>
+        <w:trPr>
+          <w:cantSplit/>
+        </w:trPr>
+        <w:tc>
+          <w:tcPr>
+            <w:tcW w:w="2493" w:type="dxa"/>
+            <w:tcMar>
+              <w:top w:w="50" w:type="dxa"/>
+              <w:left w:w="80" w:type="dxa"/>
+              <w:bottom w:w="50" w:type="dxa"/>
+              <w:right w:w="80" w:type="dxa"/>
+            </w:tcMar>
+          </w:tcPr>
+          <w:p>
+            <w:pPr>
+              <w:spacing w:after="20"/>
+            </w:pPr>
+            <w:r>
+              <w:rPr>
+                <w:sz w:val="20"/>
+              </w:rPr>
+              <w:t>auditor1</w:t>
+            </w:r>
+          </w:p>
+        </w:tc>
+        <w:tc>
+          <w:tcPr>
+            <w:tcW w:w="2266" w:type="dxa"/>
+            <w:tcMar>
+              <w:top w:w="50" w:type="dxa"/>
+              <w:left w:w="80" w:type="dxa"/>
+              <w:bottom w:w="50" w:type="dxa"/>
+              <w:right w:w="80" w:type="dxa"/>
+            </w:tcMar>
+          </w:tcPr>
+          <w:p>
+            <w:pPr>
+              <w:spacing w:after="20"/>
+            </w:pPr>
+            <w:r>
+              <w:rPr>
+                <w:sz w:val="20"/>
+              </w:rPr>
+              <w:t>AUDITOR</w:t>
+            </w:r>
+          </w:p>
+        </w:tc>
+        <w:tc>
+          <w:tcPr>
+            <w:tcW w:w="4533" w:type="dxa"/>
+            <w:tcMar>
+              <w:top w:w="50" w:type="dxa"/>
+              <w:left w:w="80" w:type="dxa"/>
+              <w:bottom w:w="50" w:type="dxa"/>
+              <w:right w:w="80" w:type="dxa"/>
+            </w:tcMar>
+          </w:tcPr>
+          <w:p>
+            <w:pPr>
+              <w:spacing w:after="20"/>
+            </w:pPr>
+            <w:r>
+              <w:rPr>
+                <w:sz w:val="20"/>
+              </w:rPr>
+              <w:t>Consultas, bitácora y conciliación sin ejecutar.</w:t>
+            </w:r>
+          </w:p>
+        </w:tc>
+      </w:tr>
+    </w:tbl>
+    <w:p>
+      <w:pPr>
+        <w:spacing w:after="80"/>
+        <w:jc w:val="both"/>
+      </w:pPr>
+    </w:p>
+    <w:p>
+      <w:pPr>
+        <w:keepNext/>
+        <w:spacing w:before="80" w:after="60"/>
+      </w:pPr>
+      <w:r>
+        <w:rPr>
+          <w:b/>
+          <w:sz w:val="20"/>
+        </w:rPr>
+        <w:t>Tabla 24.</w:t>
+      </w:r>
+      <w:r>
+        <w:rPr>
+          <w:sz w:val="20"/>
+        </w:rPr>
         <w:t xml:space="preserve"> Ambientes</w:t>
       </w:r>
     </w:p>
@@ -22872,13 +23642,7 @@
               <w:rPr>
                 <w:sz w:val="20"/>
               </w:rPr>
-              <w:t xml:space="preserve">Integración con los módulos </w:t>
-            </w:r>
-            <w:r>
-              <w:rPr>
-                <w:sz w:val="20"/>
-              </w:rPr>
-              <w:t>reales a través del Bus; evidencias de I-06.</w:t>
+              <w:t>Integración con los módulos reales a través del Bus; evidencias de I-06.</w:t>
             </w:r>
           </w:p>
         </w:tc>
@@ -22927,7 +23691,13 @@
               <w:rPr>
                 <w:sz w:val="20"/>
               </w:rPr>
-              <w:t>Versiones aprobadas; secretos y usuario de base de datos administrados por Infraestructura.</w:t>
+              <w:t>Versiones aprobadas; secretos y usuario de base de datos admini</w:t>
+            </w:r>
+            <w:r>
+              <w:rPr>
+                <w:sz w:val="20"/>
+              </w:rPr>
+              <w:t>strados por Infraestructura.</w:t>
             </w:r>
           </w:p>
         </w:tc>
@@ -22945,7 +23715,7 @@
         <w:spacing w:before="240" w:after="140" w:line="276" w:lineRule="auto"/>
         <w:outlineLvl w:val="0"/>
       </w:pPr>
-      <w:bookmarkStart w:id="35" w:name="_Toc243340545"/>
+      <w:bookmarkStart w:id="35" w:name="_Toc243342867"/>
       <w:r>
         <w:rPr>
           <w:b/>
@@ -22961,10 +23731,10 @@
         <w:jc w:val="both"/>
       </w:pPr>
       <w:r>
-        <w:t>El módulo expone los datos necesarios para medir los indicad</w:t>
-      </w:r>
-      <w:r>
-        <w:t>ores propuestos en I-05. Las metas numéricas siguen pendientes de validación con el Comité e Infraestructura (AC-42).</w:t>
+        <w:t xml:space="preserve">El módulo expone los datos necesarios para medir los indicadores propuestos en I-05. Las metas numéricas siguen pendientes de validación con el Comité e </w:t>
+      </w:r>
+      <w:r>
+        <w:t>Infraestructura (AC-42).</w:t>
       </w:r>
     </w:p>
     <w:p>
@@ -22977,7 +23747,7 @@
           <w:b/>
           <w:sz w:val="20"/>
         </w:rPr>
-        <w:t>Tabla 24.</w:t>
+        <w:t>Tabla 25.</w:t>
       </w:r>
       <w:r>
         <w:rPr>
@@ -23128,13 +23898,7 @@
               <w:rPr>
                 <w:sz w:val="19"/>
               </w:rPr>
-              <w:t xml:space="preserve">(minutos acordados − minutos sin </w:t>
-            </w:r>
-            <w:r>
-              <w:rPr>
-                <w:sz w:val="19"/>
-              </w:rPr>
-              <w:t>servicio) / minutos acordados × 100</w:t>
+              <w:t>(minutos acordados − minutos sin servicio) / minutos acordados × 100</w:t>
             </w:r>
           </w:p>
         </w:tc>
@@ -23205,7 +23969,13 @@
               <w:rPr>
                 <w:sz w:val="19"/>
               </w:rPr>
-              <w:t>p95 de la confirmación, separando la espera en dependencias</w:t>
+              <w:t xml:space="preserve">p95 de la </w:t>
+            </w:r>
+            <w:r>
+              <w:rPr>
+                <w:sz w:val="19"/>
+              </w:rPr>
+              <w:t>confirmación, separando la espera en dependencias</w:t>
             </w:r>
           </w:p>
         </w:tc>
@@ -23283,13 +24053,7 @@
               <w:rPr>
                 <w:sz w:val="19"/>
               </w:rPr>
-              <w:t xml:space="preserve">órdenes RECHAZADAS por error técnico / </w:t>
-            </w:r>
-            <w:r>
-              <w:rPr>
-                <w:sz w:val="19"/>
-              </w:rPr>
-              <w:t>intentos válidos × 100</w:t>
+              <w:t>órdenes RECHAZADAS por error técnico / intentos válidos × 100</w:t>
             </w:r>
           </w:p>
         </w:tc>
@@ -23345,7 +24109,6 @@
               <w:rPr>
                 <w:sz w:val="19"/>
               </w:rPr>
-              <w:lastRenderedPageBreak/>
               <w:t>Abonos sin confirmar</w:t>
             </w:r>
           </w:p>
@@ -23368,7 +24131,13 @@
               <w:rPr>
                 <w:sz w:val="19"/>
               </w:rPr>
-              <w:t>órdenes EN_PROCESO o POR_VERIFICAR / solicitudes de abono × 100</w:t>
+              <w:t xml:space="preserve">órdenes </w:t>
+            </w:r>
+            <w:r>
+              <w:rPr>
+                <w:sz w:val="19"/>
+              </w:rPr>
+              <w:t>EN_PROCESO o POR_VERIFICAR / solicitudes de abono × 100</w:t>
             </w:r>
           </w:p>
         </w:tc>
@@ -23511,13 +24280,19 @@
           <w:b/>
           <w:sz w:val="20"/>
         </w:rPr>
-        <w:t>Tabla 25.</w:t>
+        <w:t>Tabla 26.</w:t>
       </w:r>
       <w:r>
         <w:rPr>
           <w:sz w:val="20"/>
         </w:rPr>
-        <w:t xml:space="preserve"> Incidentes de I-04 y respuesta del módulo</w:t>
+        <w:t xml:space="preserve"> Incidentes de I-</w:t>
+      </w:r>
+      <w:r>
+        <w:rPr>
+          <w:sz w:val="20"/>
+        </w:rPr>
+        <w:t>04 y respuesta del módulo</w:t>
       </w:r>
     </w:p>
     <w:tbl>
@@ -23637,13 +24412,7 @@
               <w:rPr>
                 <w:sz w:val="20"/>
               </w:rPr>
-              <w:t xml:space="preserve">POR_VERIFICAR, recuperador, verificación manual, </w:t>
-            </w:r>
-            <w:r>
-              <w:rPr>
-                <w:sz w:val="20"/>
-              </w:rPr>
-              <w:t>alerta por antigüedad y prohibición de reintentar el abono.</w:t>
+              <w:t>POR_VERIFICAR, recuperador, verificación manual, alerta por antigüedad y prohibición de reintentar el abono.</w:t>
             </w:r>
           </w:p>
         </w:tc>
@@ -23670,7 +24439,13 @@
               <w:rPr>
                 <w:sz w:val="20"/>
               </w:rPr>
-              <w:t>INC-02 Falla de notificación a Cobranza</w:t>
+              <w:t xml:space="preserve">INC-02 Falla de </w:t>
+            </w:r>
+            <w:r>
+              <w:rPr>
+                <w:sz w:val="20"/>
+              </w:rPr>
+              <w:t>notificación a Cobranza</w:t>
             </w:r>
           </w:p>
         </w:tc>
@@ -23741,7 +24516,13 @@
               <w:rPr>
                 <w:sz w:val="20"/>
               </w:rPr>
-              <w:t>Las órdenes quedan en estados recuperables; al volver, el recuperador y el despachador retoman sin duplicar.</w:t>
+              <w:t xml:space="preserve">Las órdenes quedan en estados recuperables; al volver, el recuperador y el </w:t>
+            </w:r>
+            <w:r>
+              <w:rPr>
+                <w:sz w:val="20"/>
+              </w:rPr>
+              <w:t>despachador retoman sin duplicar.</w:t>
             </w:r>
           </w:p>
         </w:tc>
@@ -23759,7 +24540,7 @@
         <w:spacing w:before="240" w:after="140" w:line="276" w:lineRule="auto"/>
         <w:outlineLvl w:val="0"/>
       </w:pPr>
-      <w:bookmarkStart w:id="36" w:name="_Toc243340546"/>
+      <w:bookmarkStart w:id="36" w:name="_Toc243342868"/>
       <w:r>
         <w:rPr>
           <w:b/>
@@ -23785,10 +24566,10 @@
         <w:t>08_desembolso.sql</w:t>
       </w:r>
       <w:r>
-        <w:t>) y contra el simulado</w:t>
-      </w:r>
-      <w:r>
-        <w:t>r del Bus levantado en un hilo, de modo que los tiempos de espera, la concurrencia y los triggers se ejercitan de verdad. Los escenarios replican la tabla de verificación de la Fase I.</w:t>
+        <w:t xml:space="preserve">) y contra el simulador del Bus levantado en un hilo, de modo que los tiempos de espera, la </w:t>
+      </w:r>
+      <w:r>
+        <w:t>concurrencia y los triggers se ejercitan de verdad. Los escenarios replican la tabla de verificación de la Fase I.</w:t>
       </w:r>
     </w:p>
     <w:p>
@@ -23801,7 +24582,8 @@
           <w:b/>
           <w:sz w:val="20"/>
         </w:rPr>
-        <w:t>Tabla 26.</w:t>
+        <w:lastRenderedPageBreak/>
+        <w:t>Tabla 27.</w:t>
       </w:r>
       <w:r>
         <w:rPr>
@@ -23880,14 +24662,7 @@
                 <w:b/>
                 <w:sz w:val="18"/>
               </w:rPr>
-              <w:t>Resultado es</w:t>
-            </w:r>
-            <w:r>
-              <w:rPr>
-                <w:b/>
-                <w:sz w:val="18"/>
-              </w:rPr>
-              <w:t>perado</w:t>
+              <w:t>Resultado esperado</w:t>
             </w:r>
           </w:p>
         </w:tc>
@@ -23984,7 +24759,13 @@
               <w:rPr>
                 <w:sz w:val="18"/>
               </w:rPr>
-              <w:t>La orden no avanza y no se invoca a Cuentas.</w:t>
+              <w:t xml:space="preserve">La orden no avanza y no </w:t>
+            </w:r>
+            <w:r>
+              <w:rPr>
+                <w:sz w:val="18"/>
+              </w:rPr>
+              <w:t>se invoca a Cuentas.</w:t>
             </w:r>
           </w:p>
         </w:tc>
@@ -24029,7 +24810,7 @@
               <w:rPr>
                 <w:sz w:val="18"/>
               </w:rPr>
-              <w:t>Pendiente de ejecución</w:t>
+              <w:t>Aprobada</w:t>
             </w:r>
           </w:p>
         </w:tc>
@@ -24123,7 +24904,7 @@
               <w:rPr>
                 <w:sz w:val="18"/>
               </w:rPr>
-              <w:t>Pendiente de ejecución</w:t>
+              <w:t>Aprobada</w:t>
             </w:r>
           </w:p>
         </w:tc>
@@ -24217,7 +24998,7 @@
               <w:rPr>
                 <w:sz w:val="18"/>
               </w:rPr>
-              <w:t>Pendiente de ejecución</w:t>
+              <w:t>Aprobada</w:t>
             </w:r>
           </w:p>
         </w:tc>
@@ -24289,14 +25070,7 @@
                 <w:rFonts w:ascii="Consolas" w:hAnsi="Consolas"/>
                 <w:sz w:val="15"/>
               </w:rPr>
-              <w:t>test</w:t>
-            </w:r>
-            <w:r>
-              <w:rPr>
-                <w:rFonts w:ascii="Consolas" w:hAnsi="Consolas"/>
-                <w:sz w:val="15"/>
-              </w:rPr>
-              <w:t>_aprobacion_no_habilitada_no_permite_preparar</w:t>
+              <w:t>test_aprobacion_no_habilitada_no_permite_preparar</w:t>
             </w:r>
           </w:p>
         </w:tc>
@@ -24318,7 +25092,7 @@
               <w:rPr>
                 <w:sz w:val="18"/>
               </w:rPr>
-              <w:t>Pendiente de ejecución</w:t>
+              <w:t>Aprobada</w:t>
             </w:r>
           </w:p>
         </w:tc>
@@ -24412,7 +25186,7 @@
               <w:rPr>
                 <w:sz w:val="18"/>
               </w:rPr>
-              <w:t>Pendiente de ejecución</w:t>
+              <w:t>Aprobada</w:t>
             </w:r>
           </w:p>
         </w:tc>
@@ -24461,13 +25235,7 @@
               <w:rPr>
                 <w:sz w:val="18"/>
               </w:rPr>
-              <w:t xml:space="preserve">Conflicto 409; la orden </w:t>
-            </w:r>
-            <w:r>
-              <w:rPr>
-                <w:sz w:val="18"/>
-              </w:rPr>
-              <w:t>original no cambia.</w:t>
+              <w:t>Conflicto 409; la orden original no cambia.</w:t>
             </w:r>
           </w:p>
         </w:tc>
@@ -24512,7 +25280,7 @@
               <w:rPr>
                 <w:sz w:val="18"/>
               </w:rPr>
-              <w:t>Pendiente de ejecución</w:t>
+              <w:t>Aprobada</w:t>
             </w:r>
           </w:p>
         </w:tc>
@@ -24584,7 +25352,14 @@
                 <w:rFonts w:ascii="Consolas" w:hAnsi="Consolas"/>
                 <w:sz w:val="15"/>
               </w:rPr>
-              <w:t>test_flujo_completo_confirmado</w:t>
+              <w:t>test_flujo_com</w:t>
+            </w:r>
+            <w:r>
+              <w:rPr>
+                <w:rFonts w:ascii="Consolas" w:hAnsi="Consolas"/>
+                <w:sz w:val="15"/>
+              </w:rPr>
+              <w:t>pleto_confirmado</w:t>
             </w:r>
           </w:p>
         </w:tc>
@@ -24606,7 +25381,7 @@
               <w:rPr>
                 <w:sz w:val="18"/>
               </w:rPr>
-              <w:t>Pendiente de ejecución</w:t>
+              <w:t>Aprobada</w:t>
             </w:r>
           </w:p>
         </w:tc>
@@ -24633,13 +25408,7 @@
               <w:rPr>
                 <w:sz w:val="18"/>
               </w:rPr>
-              <w:t>Dos confirmaciones concurrentes del mismo c</w:t>
-            </w:r>
-            <w:r>
-              <w:rPr>
-                <w:sz w:val="18"/>
-              </w:rPr>
-              <w:t>rédito</w:t>
+              <w:t>Dos confirmaciones concurrentes del mismo crédito</w:t>
             </w:r>
           </w:p>
         </w:tc>
@@ -24706,7 +25475,7 @@
               <w:rPr>
                 <w:sz w:val="18"/>
               </w:rPr>
-              <w:t>Pendiente de ejecución</w:t>
+              <w:t>Aprobada</w:t>
             </w:r>
           </w:p>
         </w:tc>
@@ -24800,7 +25569,7 @@
               <w:rPr>
                 <w:sz w:val="18"/>
               </w:rPr>
-              <w:t>Pendiente de ejecución</w:t>
+              <w:t>Aprobada</w:t>
             </w:r>
           </w:p>
         </w:tc>
@@ -24894,7 +25663,7 @@
               <w:rPr>
                 <w:sz w:val="18"/>
               </w:rPr>
-              <w:t>Pendiente de ejecución</w:t>
+              <w:t>Aprobada</w:t>
             </w:r>
           </w:p>
         </w:tc>
@@ -24943,13 +25712,7 @@
               <w:rPr>
                 <w:sz w:val="18"/>
               </w:rPr>
-              <w:t>POR_VERIFICAR y luego CONFIRMADA sin</w:t>
-            </w:r>
-            <w:r>
-              <w:rPr>
-                <w:sz w:val="18"/>
-              </w:rPr>
-              <w:t xml:space="preserve"> duplicar el abono.</w:t>
+              <w:t>POR_VERIFICAR y luego CONFIRMADA sin duplicar el abono.</w:t>
             </w:r>
           </w:p>
         </w:tc>
@@ -24994,7 +25757,7 @@
               <w:rPr>
                 <w:sz w:val="18"/>
               </w:rPr>
-              <w:t>Pendiente de ejecución</w:t>
+              <w:t>Aprobada</w:t>
             </w:r>
           </w:p>
         </w:tc>
@@ -25088,7 +25851,7 @@
               <w:rPr>
                 <w:sz w:val="18"/>
               </w:rPr>
-              <w:t>Pendiente de ejecución</w:t>
+              <w:t>Aprobada</w:t>
             </w:r>
           </w:p>
         </w:tc>
@@ -25115,36 +25878,35 @@
               <w:rPr>
                 <w:sz w:val="18"/>
               </w:rPr>
-              <w:lastRenderedPageBreak/>
-              <w:t xml:space="preserve">Reenvío del mismo </w:t>
-            </w:r>
+              <w:t>Entrega fallida tras los reintentos</w:t>
+            </w:r>
+          </w:p>
+        </w:tc>
+        <w:tc>
+          <w:tcPr>
+            <w:tcW w:w="2833" w:type="dxa"/>
+            <w:tcMar>
+              <w:top w:w="50" w:type="dxa"/>
+              <w:left w:w="80" w:type="dxa"/>
+              <w:bottom w:w="50" w:type="dxa"/>
+              <w:right w:w="80" w:type="dxa"/>
+            </w:tcMar>
+          </w:tcPr>
+          <w:p>
+            <w:pPr>
+              <w:spacing w:after="20"/>
+            </w:pPr>
             <w:r>
               <w:rPr>
                 <w:sz w:val="18"/>
               </w:rPr>
-              <w:t>evento</w:t>
-            </w:r>
-          </w:p>
-        </w:tc>
-        <w:tc>
-          <w:tcPr>
-            <w:tcW w:w="2833" w:type="dxa"/>
-            <w:tcMar>
-              <w:top w:w="50" w:type="dxa"/>
-              <w:left w:w="80" w:type="dxa"/>
-              <w:bottom w:w="50" w:type="dxa"/>
-              <w:right w:w="80" w:type="dxa"/>
-            </w:tcMar>
-          </w:tcPr>
-          <w:p>
-            <w:pPr>
-              <w:spacing w:after="20"/>
-            </w:pPr>
+              <w:t xml:space="preserve">Evento FALLIDO visible en el </w:t>
+            </w:r>
             <w:r>
               <w:rPr>
                 <w:sz w:val="18"/>
               </w:rPr>
-              <w:t>Cobranza no activa dos veces el crédito.</w:t>
+              <w:t>monitor; el reintento manual lo entrega.</w:t>
             </w:r>
           </w:p>
         </w:tc>
@@ -25167,7 +25929,7 @@
                 <w:rFonts w:ascii="Consolas" w:hAnsi="Consolas"/>
                 <w:sz w:val="15"/>
               </w:rPr>
-              <w:t>test_reenvio_evento_no_duplica_activacion</w:t>
+              <w:t>test_entrega_fallida_tras_reintentos_y_reintento_manual</w:t>
             </w:r>
           </w:p>
         </w:tc>
@@ -25189,7 +25951,7 @@
               <w:rPr>
                 <w:sz w:val="18"/>
               </w:rPr>
-              <w:t>Pendiente de ejecución</w:t>
+              <w:t>Aprobada</w:t>
             </w:r>
           </w:p>
         </w:tc>
@@ -25216,7 +25978,7 @@
               <w:rPr>
                 <w:sz w:val="18"/>
               </w:rPr>
-              <w:t>Acceso sin permisos</w:t>
+              <w:t>Reenvío del mismo evento</w:t>
             </w:r>
           </w:p>
         </w:tc>
@@ -25238,7 +26000,7 @@
               <w:rPr>
                 <w:sz w:val="18"/>
               </w:rPr>
-              <w:t>403 y registro en la bitácora.</w:t>
+              <w:t>Cobranza no activa dos veces el crédito.</w:t>
             </w:r>
           </w:p>
         </w:tc>
@@ -25261,7 +26023,7 @@
                 <w:rFonts w:ascii="Consolas" w:hAnsi="Consolas"/>
                 <w:sz w:val="15"/>
               </w:rPr>
-              <w:t>test_acceso_sin_permiso_es_auditado</w:t>
+              <w:t>test_reenvio_evento_no_duplica_activacion</w:t>
             </w:r>
           </w:p>
         </w:tc>
@@ -25283,7 +26045,7 @@
               <w:rPr>
                 <w:sz w:val="18"/>
               </w:rPr>
-              <w:t>Pendiente de ejecución</w:t>
+              <w:t>Aprobada</w:t>
             </w:r>
           </w:p>
         </w:tc>
@@ -25310,35 +26072,35 @@
               <w:rPr>
                 <w:sz w:val="18"/>
               </w:rPr>
-              <w:t xml:space="preserve">Constancia de orden no </w:t>
-            </w:r>
+              <w:t>Acceso sin permisos</w:t>
+            </w:r>
+          </w:p>
+        </w:tc>
+        <w:tc>
+          <w:tcPr>
+            <w:tcW w:w="2833" w:type="dxa"/>
+            <w:tcMar>
+              <w:top w:w="50" w:type="dxa"/>
+              <w:left w:w="80" w:type="dxa"/>
+              <w:bottom w:w="50" w:type="dxa"/>
+              <w:right w:w="80" w:type="dxa"/>
+            </w:tcMar>
+          </w:tcPr>
+          <w:p>
+            <w:pPr>
+              <w:spacing w:after="20"/>
+            </w:pPr>
             <w:r>
               <w:rPr>
                 <w:sz w:val="18"/>
               </w:rPr>
-              <w:t>confirmada</w:t>
-            </w:r>
-          </w:p>
-        </w:tc>
-        <w:tc>
-          <w:tcPr>
-            <w:tcW w:w="2833" w:type="dxa"/>
-            <w:tcMar>
-              <w:top w:w="50" w:type="dxa"/>
-              <w:left w:w="80" w:type="dxa"/>
-              <w:bottom w:w="50" w:type="dxa"/>
-              <w:right w:w="80" w:type="dxa"/>
-            </w:tcMar>
-          </w:tcPr>
-          <w:p>
-            <w:pPr>
-              <w:spacing w:after="20"/>
-            </w:pPr>
+              <w:t>403 y regis</w:t>
+            </w:r>
             <w:r>
               <w:rPr>
                 <w:sz w:val="18"/>
               </w:rPr>
-              <w:t>No se emite.</w:t>
+              <w:t>tro en la bitácora.</w:t>
             </w:r>
           </w:p>
         </w:tc>
@@ -25361,7 +26123,7 @@
                 <w:rFonts w:ascii="Consolas" w:hAnsi="Consolas"/>
                 <w:sz w:val="15"/>
               </w:rPr>
-              <w:t>test_constancia_solo_confirmada</w:t>
+              <w:t>test_acceso_sin_permiso_es_auditado</w:t>
             </w:r>
           </w:p>
         </w:tc>
@@ -25383,7 +26145,7 @@
               <w:rPr>
                 <w:sz w:val="18"/>
               </w:rPr>
-              <w:t>Pendiente de ejecución</w:t>
+              <w:t>Aprobada</w:t>
             </w:r>
           </w:p>
         </w:tc>
@@ -25410,7 +26172,7 @@
               <w:rPr>
                 <w:sz w:val="18"/>
               </w:rPr>
-              <w:t>Conciliación del día</w:t>
+              <w:t>Constancia de orden no confirmada</w:t>
             </w:r>
           </w:p>
         </w:tc>
@@ -25432,7 +26194,7 @@
               <w:rPr>
                 <w:sz w:val="18"/>
               </w:rPr>
-              <w:t>Sin diferencias; origen caído produce 503.</w:t>
+              <w:t>No se emite.</w:t>
             </w:r>
           </w:p>
         </w:tc>
@@ -25455,7 +26217,7 @@
                 <w:rFonts w:ascii="Consolas" w:hAnsi="Consolas"/>
                 <w:sz w:val="15"/>
               </w:rPr>
-              <w:t>test_conciliacion</w:t>
+              <w:t>test_constancia_solo_confirmada</w:t>
             </w:r>
           </w:p>
         </w:tc>
@@ -25477,7 +26239,7 @@
               <w:rPr>
                 <w:sz w:val="18"/>
               </w:rPr>
-              <w:t>Pendiente de ejecución</w:t>
+              <w:t>Aprobada</w:t>
             </w:r>
           </w:p>
         </w:tc>
@@ -25504,7 +26266,7 @@
               <w:rPr>
                 <w:sz w:val="18"/>
               </w:rPr>
-              <w:t>Reversión</w:t>
+              <w:t>Conciliación del día</w:t>
             </w:r>
           </w:p>
         </w:tc>
@@ -25526,7 +26288,7 @@
               <w:rPr>
                 <w:sz w:val="18"/>
               </w:rPr>
-              <w:t>Deshabilitada por defecto; con política, cuatro ojos.</w:t>
+              <w:t>Sin diferencias; origen caído produce 503.</w:t>
             </w:r>
           </w:p>
         </w:tc>
@@ -25549,7 +26311,7 @@
                 <w:rFonts w:ascii="Consolas" w:hAnsi="Consolas"/>
                 <w:sz w:val="15"/>
               </w:rPr>
-              <w:t>test_reversion</w:t>
+              <w:t>test_conciliacion</w:t>
             </w:r>
           </w:p>
         </w:tc>
@@ -25571,7 +26333,7 @@
               <w:rPr>
                 <w:sz w:val="18"/>
               </w:rPr>
-              <w:t>Pendiente de ejecución</w:t>
+              <w:t>Aprobada</w:t>
             </w:r>
           </w:p>
         </w:tc>
@@ -25598,7 +26360,7 @@
               <w:rPr>
                 <w:sz w:val="18"/>
               </w:rPr>
-              <w:t>Integridad en base de datos</w:t>
+              <w:t>Reversión</w:t>
             </w:r>
           </w:p>
         </w:tc>
@@ -25620,7 +26382,7 @@
               <w:rPr>
                 <w:sz w:val="18"/>
               </w:rPr>
-              <w:t>Triggers y restricciones rechazan cambios inválidos.</w:t>
+              <w:t>Deshabilitada por defecto; con política, cuatro ojos.</w:t>
             </w:r>
           </w:p>
         </w:tc>
@@ -25643,6 +26405,100 @@
                 <w:rFonts w:ascii="Consolas" w:hAnsi="Consolas"/>
                 <w:sz w:val="15"/>
               </w:rPr>
+              <w:t>test_reversion</w:t>
+            </w:r>
+          </w:p>
+        </w:tc>
+        <w:tc>
+          <w:tcPr>
+            <w:tcW w:w="1133" w:type="dxa"/>
+            <w:tcMar>
+              <w:top w:w="50" w:type="dxa"/>
+              <w:left w:w="80" w:type="dxa"/>
+              <w:bottom w:w="50" w:type="dxa"/>
+              <w:right w:w="80" w:type="dxa"/>
+            </w:tcMar>
+          </w:tcPr>
+          <w:p>
+            <w:pPr>
+              <w:spacing w:after="20"/>
+            </w:pPr>
+            <w:r>
+              <w:rPr>
+                <w:sz w:val="18"/>
+              </w:rPr>
+              <w:t>Aprobada</w:t>
+            </w:r>
+          </w:p>
+        </w:tc>
+      </w:tr>
+      <w:tr>
+        <w:trPr>
+          <w:cantSplit/>
+        </w:trPr>
+        <w:tc>
+          <w:tcPr>
+            <w:tcW w:w="2266" w:type="dxa"/>
+            <w:tcMar>
+              <w:top w:w="50" w:type="dxa"/>
+              <w:left w:w="80" w:type="dxa"/>
+              <w:bottom w:w="50" w:type="dxa"/>
+              <w:right w:w="80" w:type="dxa"/>
+            </w:tcMar>
+          </w:tcPr>
+          <w:p>
+            <w:pPr>
+              <w:spacing w:after="20"/>
+            </w:pPr>
+            <w:r>
+              <w:rPr>
+                <w:sz w:val="18"/>
+              </w:rPr>
+              <w:t>Integridad en base de datos</w:t>
+            </w:r>
+          </w:p>
+        </w:tc>
+        <w:tc>
+          <w:tcPr>
+            <w:tcW w:w="2833" w:type="dxa"/>
+            <w:tcMar>
+              <w:top w:w="50" w:type="dxa"/>
+              <w:left w:w="80" w:type="dxa"/>
+              <w:bottom w:w="50" w:type="dxa"/>
+              <w:right w:w="80" w:type="dxa"/>
+            </w:tcMar>
+          </w:tcPr>
+          <w:p>
+            <w:pPr>
+              <w:spacing w:after="20"/>
+            </w:pPr>
+            <w:r>
+              <w:rPr>
+                <w:sz w:val="18"/>
+              </w:rPr>
+              <w:t>Triggers y restricciones rechazan cambios inválidos.</w:t>
+            </w:r>
+          </w:p>
+        </w:tc>
+        <w:tc>
+          <w:tcPr>
+            <w:tcW w:w="3060" w:type="dxa"/>
+            <w:tcMar>
+              <w:top w:w="50" w:type="dxa"/>
+              <w:left w:w="80" w:type="dxa"/>
+              <w:bottom w:w="50" w:type="dxa"/>
+              <w:right w:w="80" w:type="dxa"/>
+            </w:tcMar>
+          </w:tcPr>
+          <w:p>
+            <w:pPr>
+              <w:spacing w:after="20"/>
+            </w:pPr>
+            <w:r>
+              <w:rPr>
+                <w:rFonts w:ascii="Consolas" w:hAnsi="Consolas"/>
+                <w:sz w:val="15"/>
+              </w:rPr>
               <w:t>test_bd_integridad</w:t>
             </w:r>
           </w:p>
@@ -25665,7 +26521,7 @@
               <w:rPr>
                 <w:sz w:val="18"/>
               </w:rPr>
-              <w:t>Pendiente de ejecución</w:t>
+              <w:t>Aprobada</w:t>
             </w:r>
           </w:p>
         </w:tc>
@@ -25679,11 +26535,33 @@
     </w:p>
     <w:p>
       <w:pPr>
+        <w:spacing w:after="120"/>
+        <w:jc w:val="both"/>
+      </w:pPr>
+      <w:r>
+        <w:t xml:space="preserve">Resultado de la última ejecución: 19 de 19 </w:t>
+      </w:r>
+      <w:r>
+        <w:t>pruebas aprobadas (</w:t>
+      </w:r>
+      <w:r>
+        <w:rPr>
+          <w:rFonts w:ascii="Consolas" w:hAnsi="Consolas"/>
+          <w:sz w:val="21"/>
+        </w:rPr>
+        <w:t>docs/evidencias/pytest-junit.xml</w:t>
+      </w:r>
+      <w:r>
+        <w:t>).</w:t>
+      </w:r>
+    </w:p>
+    <w:p>
+      <w:pPr>
         <w:keepNext/>
         <w:spacing w:before="240" w:after="140" w:line="276" w:lineRule="auto"/>
         <w:outlineLvl w:val="0"/>
       </w:pPr>
-      <w:bookmarkStart w:id="37" w:name="_Toc243340547"/>
+      <w:bookmarkStart w:id="37" w:name="_Toc243342869"/>
       <w:r>
         <w:rPr>
           <w:b/>
@@ -25703,7 +26581,7 @@
           <w:b/>
           <w:sz w:val="20"/>
         </w:rPr>
-        <w:t>Tabla 27.</w:t>
+        <w:t>Tabla 28.</w:t>
       </w:r>
       <w:r>
         <w:rPr>
@@ -25879,7 +26757,13 @@
               <w:rPr>
                 <w:sz w:val="18"/>
               </w:rPr>
-              <w:t>Permisos para consumir Cuentas y Evaluación</w:t>
+              <w:t xml:space="preserve">Permisos para </w:t>
+            </w:r>
+            <w:r>
+              <w:rPr>
+                <w:sz w:val="18"/>
+              </w:rPr>
+              <w:t>consumir Cuentas y Evaluación</w:t>
             </w:r>
           </w:p>
         </w:tc>
@@ -25901,13 +26785,7 @@
               <w:rPr>
                 <w:sz w:val="18"/>
               </w:rPr>
-              <w:t xml:space="preserve">El módulo llama con su token de servicio; el usuario solo necesita </w:t>
-            </w:r>
-            <w:r>
-              <w:rPr>
-                <w:sz w:val="18"/>
-              </w:rPr>
-              <w:t>DESEMBOLSO_*.</w:t>
+              <w:t>El módulo llama con su token de servicio; el usuario solo necesita DESEMBOLSO_*.</w:t>
             </w:r>
           </w:p>
         </w:tc>
@@ -25957,6 +26835,7 @@
               <w:rPr>
                 <w:sz w:val="18"/>
               </w:rPr>
+              <w:lastRenderedPageBreak/>
               <w:t>OBS-DES-03</w:t>
             </w:r>
           </w:p>
@@ -26014,7 +26893,13 @@
               <w:rPr>
                 <w:sz w:val="18"/>
               </w:rPr>
-              <w:t>; si es el CORE, solo cambia el adaptador.</w:t>
+              <w:t xml:space="preserve">; si es el CORE, solo cambia el </w:t>
+            </w:r>
+            <w:r>
+              <w:rPr>
+                <w:sz w:val="18"/>
+              </w:rPr>
+              <w:t>adaptador.</w:t>
             </w:r>
           </w:p>
         </w:tc>
@@ -26108,13 +26993,7 @@
               <w:rPr>
                 <w:sz w:val="18"/>
               </w:rPr>
-              <w:t xml:space="preserve">Clave por orden y unicidad por </w:t>
-            </w:r>
-            <w:r>
-              <w:rPr>
-                <w:sz w:val="18"/>
-              </w:rPr>
-              <w:t>crédito; consulta antes de reintentar.</w:t>
+              <w:t>Clave por orden y unicidad por crédito; consulta antes de reintentar.</w:t>
             </w:r>
           </w:p>
         </w:tc>
@@ -26208,7 +27087,13 @@
               <w:rPr>
                 <w:sz w:val="18"/>
               </w:rPr>
-              <w:t>Desembolso envía fecha efectiva y versión; no calcula el calendario.</w:t>
+              <w:t>Desembolso envía fecha efectiva y versión; no calcula el calendario</w:t>
+            </w:r>
+            <w:r>
+              <w:rPr>
+                <w:sz w:val="18"/>
+              </w:rPr>
+              <w:t>.</w:t>
             </w:r>
           </w:p>
         </w:tc>
@@ -26301,13 +27186,7 @@
               <w:rPr>
                 <w:sz w:val="18"/>
               </w:rPr>
-              <w:t xml:space="preserve">Outbox con llamada idempotente y </w:t>
-            </w:r>
-            <w:r>
-              <w:rPr>
-                <w:sz w:val="18"/>
-              </w:rPr>
-              <w:t>reintentos.</w:t>
+              <w:t>Outbox con llamada idempotente y reintentos.</w:t>
             </w:r>
           </w:p>
         </w:tc>
@@ -26508,13 +27387,7 @@
               <w:rPr>
                 <w:sz w:val="18"/>
               </w:rPr>
-              <w:t>Contratos de la sección 11.3 y t</w:t>
-            </w:r>
-            <w:r>
-              <w:rPr>
-                <w:sz w:val="18"/>
-              </w:rPr>
-              <w:t>iempo de espera de 3 s.</w:t>
+              <w:t>Contratos de la sección 11.3 y tiempo de espera de 3 s.</w:t>
             </w:r>
           </w:p>
         </w:tc>
@@ -26701,7 +27574,13 @@
               <w:rPr>
                 <w:sz w:val="18"/>
               </w:rPr>
-              <w:t>Se mide solo el tiempo propio; los tiempos extremo a extremo son referenciales.</w:t>
+              <w:t xml:space="preserve">Se mide </w:t>
+            </w:r>
+            <w:r>
+              <w:rPr>
+                <w:sz w:val="18"/>
+              </w:rPr>
+              <w:t>solo el tiempo propio; los tiempos extremo a extremo son referenciales.</w:t>
             </w:r>
           </w:p>
         </w:tc>
@@ -26741,20 +27620,13 @@
         <w:spacing w:before="240" w:after="140" w:line="276" w:lineRule="auto"/>
         <w:outlineLvl w:val="0"/>
       </w:pPr>
-      <w:bookmarkStart w:id="38" w:name="_Toc243340548"/>
+      <w:bookmarkStart w:id="38" w:name="_Toc243342870"/>
       <w:r>
         <w:rPr>
           <w:b/>
           <w:sz w:val="28"/>
         </w:rPr>
-        <w:t xml:space="preserve">19. </w:t>
-      </w:r>
-      <w:r>
-        <w:rPr>
-          <w:b/>
-          <w:sz w:val="28"/>
-        </w:rPr>
-        <w:t>Conclusiones</w:t>
+        <w:t>19. Conclusiones</w:t>
       </w:r>
       <w:bookmarkEnd w:id="38"/>
     </w:p>
@@ -26768,7 +27640,10 @@
         <w:ind w:left="425" w:hanging="283"/>
       </w:pPr>
       <w:r>
-        <w:t>El módulo implementa el servicio SRV-CR-04 dentro de los límites acordados: decide sobre su propia orden y consume como servicios la aprobación, la identidad, la cuenta, el abono y la entrega a Cobranza.</w:t>
+        <w:t>El módulo implementa el servicio SRV-CR-04 dentro de los límites acordados: decide sobre su propia orden y consume como servicios la aprobación, la identida</w:t>
+      </w:r>
+      <w:r>
+        <w:t>d, la cuenta, el abono y la entrega a Cobranza.</w:t>
       </w:r>
     </w:p>
     <w:p>
@@ -26781,10 +27656,10 @@
         <w:ind w:left="425" w:hanging="283"/>
       </w:pPr>
       <w:r>
-        <w:t xml:space="preserve">La integridad financiera no depende de </w:t>
-      </w:r>
-      <w:r>
-        <w:t>una sola capa: la API controla estados e idempotencia, y la base de datos repite los controles críticos (un desembolso por crédito, transiciones válidas, bitácora inalterable).</w:t>
+        <w:t>La integridad financiera no depende de una sola capa: la API controla estados e idempotencia, y la base de datos repite los controles críticos (un desembolso por crédito, transiciones válidas, bitácora inalte</w:t>
+      </w:r>
+      <w:r>
+        <w:t>rable).</w:t>
       </w:r>
     </w:p>
     <w:p>
@@ -26797,10 +27672,7 @@
         <w:ind w:left="425" w:hanging="283"/>
       </w:pPr>
       <w:r>
-        <w:t>El estado POR_VERIFICAR y el outbox convierten las fallas de comunicación en si</w:t>
-      </w:r>
-      <w:r>
-        <w:t>tuaciones recuperables y trazables, en lugar de abonos duplicados o desembolsos perdidos para Cobranza.</w:t>
+        <w:t>El estado POR_VERIFICAR y el outbox convierten las fallas de comunicación en situaciones recuperables y trazables, en lugar de abonos duplicados o desembolsos perdidos para Cobranza.</w:t>
       </w:r>
     </w:p>
     <w:p>
@@ -26813,11 +27685,10 @@
         <w:ind w:left="425" w:hanging="283"/>
       </w:pPr>
       <w:r>
-        <w:lastRenderedPageBreak/>
-        <w:t>Las decisiones pendientes quedan aisladas en adaptadores y parámetros de configuración, de modo que su ratificación por los comités no obliga a rediseña</w:t>
-      </w:r>
-      <w:r>
-        <w:t>r el módulo.</w:t>
+        <w:t>Las decisiones pendientes quedan aisladas en adaptadores y paráme</w:t>
+      </w:r>
+      <w:r>
+        <w:t>tros de configuración, de modo que su ratificación por los comités no obliga a rediseñar el módulo.</w:t>
       </w:r>
     </w:p>
     <w:p>
@@ -26826,7 +27697,7 @@
         <w:spacing w:before="240" w:after="140" w:line="276" w:lineRule="auto"/>
         <w:outlineLvl w:val="0"/>
       </w:pPr>
-      <w:bookmarkStart w:id="39" w:name="_Toc243340549"/>
+      <w:bookmarkStart w:id="39" w:name="_Toc243342871"/>
       <w:r>
         <w:rPr>
           <w:b/>
@@ -26851,7 +27722,10 @@
         <w:ind w:left="567" w:hanging="567"/>
       </w:pPr>
       <w:r>
-        <w:t>Comité de Créditos BNA. (2026). Referencia de dependencias TOGAF y matriz CR-INT. Universidad Católica de Santa María.</w:t>
+        <w:t xml:space="preserve">Comité de Créditos BNA. (2026). Referencia de dependencias TOGAF y </w:t>
+      </w:r>
+      <w:r>
+        <w:t>matriz CR-INT. Universidad Católica de Santa María.</w:t>
       </w:r>
     </w:p>
     <w:p>
@@ -26860,10 +27734,7 @@
         <w:ind w:left="567" w:hanging="567"/>
       </w:pPr>
       <w:r>
-        <w:t xml:space="preserve">Comité de Créditos BNA. (2026). </w:t>
-      </w:r>
-      <w:r>
-        <w:t>Lineamiento técnico común de la Línea de Créditos: Python, FastAPI y MySQL. Universidad Católica de Santa María.</w:t>
+        <w:t>Comité de Créditos BNA. (2026). Lineamiento técnico común de la Línea de Créditos: Python, FastAPI y MySQL. Universidad Católica de Santa María.</w:t>
       </w:r>
     </w:p>
     <w:p>
@@ -26872,7 +27743,10 @@
         <w:ind w:left="567" w:hanging="567"/>
       </w:pPr>
       <w:r>
-        <w:t>Comité de Créditos BNA. (2026). Informe consolidado de Fase II ITIL 4 de la Línea de Créditos (v0.1). Universidad Católica de Santa María.</w:t>
+        <w:t>Comité de Créditos BNA. (2026). Informe consolidado de Fase</w:t>
+      </w:r>
+      <w:r>
+        <w:t xml:space="preserve"> II ITIL 4 de la Línea de Créditos (v0.1). Universidad Católica de Santa María.</w:t>
       </w:r>
     </w:p>
     <w:p>
@@ -26881,10 +27755,7 @@
         <w:ind w:left="567" w:hanging="567"/>
       </w:pPr>
       <w:r>
-        <w:t>Equi</w:t>
-      </w:r>
-      <w:r>
-        <w:t>po del módulo de Desembolso. (2026). Informe de arquitectura del módulo 13 Desembolso, Fase I (TOGAF 10). Universidad Católica de Santa María.</w:t>
+        <w:t>Equipo del módulo de Desembolso. (2026). Informe de arquitectura del módulo 13 Desembolso, Fase I (TOGAF 10). Universidad Católica de Santa María.</w:t>
       </w:r>
     </w:p>
     <w:p>
@@ -26893,10 +27764,10 @@
         <w:ind w:left="567" w:hanging="567"/>
       </w:pPr>
       <w:r>
-        <w:t>Equipo del módulo de Desembolso. (2026). Modelo referencial de base de datos del módulo 13 Desembolso (v1.0). Uni</w:t>
-      </w:r>
-      <w:r>
-        <w:t>versidad Católica de Santa María.</w:t>
+        <w:t>Equipo del módulo de Desembol</w:t>
+      </w:r>
+      <w:r>
+        <w:t>so. (2026). Modelo referencial de base de datos del módulo 13 Desembolso (v1.0). Universidad Católica de Santa María.</w:t>
       </w:r>
     </w:p>
     <w:p>
@@ -26905,7 +27776,10 @@
         <w:ind w:left="567" w:hanging="567"/>
       </w:pPr>
       <w:r>
-        <w:t>Equipo del módulo de Desembolso. (2026). Servicios de TI y valor generado del módulo Desembolso (I-01), prácticas ITIL 4 (I-04) y catálogo de niveles de servicio (I-05). Universidad Católica de Santa María.</w:t>
+        <w:t>Equipo del módulo de Desembolso. (2026). Servicios de TI y valor generado del módulo Desembolso (I-01), prácticas ITIL 4 (I-04) y catálogo</w:t>
+      </w:r>
+      <w:r>
+        <w:t xml:space="preserve"> de niveles de servicio (I-05). Universidad Católica de Santa María.</w:t>
       </w:r>
     </w:p>
     <w:p>
@@ -26914,10 +27788,8 @@
         <w:ind w:left="567" w:hanging="567"/>
       </w:pPr>
       <w:r>
-        <w:t>Equipo del módu</w:t>
-      </w:r>
-      <w:r>
-        <w:t>lo de Desembolso. (2026). Acta de reunión ACT-2026-007. Universidad Católica de Santa María.</w:t>
+        <w:lastRenderedPageBreak/>
+        <w:t>Equipo del módulo de Desembolso. (2026). Acta de reunión ACT-2026-007. Universidad Católica de Santa María.</w:t>
       </w:r>
     </w:p>
     <w:p>
@@ -27830,7 +28702,7 @@
     <w:autoRedefine/>
     <w:uiPriority w:val="39"/>
     <w:unhideWhenUsed/>
-    <w:rsid w:val="004A5C04"/>
+    <w:rsid w:val="00F72E9A"/>
     <w:pPr>
       <w:spacing w:after="100"/>
     </w:pPr>
@@ -27842,7 +28714,7 @@
     <w:autoRedefine/>
     <w:uiPriority w:val="39"/>
     <w:unhideWhenUsed/>
-    <w:rsid w:val="004A5C04"/>
+    <w:rsid w:val="00F72E9A"/>
     <w:pPr>
       <w:spacing w:after="100"/>
       <w:ind w:left="240"/>
@@ -27853,7 +28725,7 @@
     <w:basedOn w:val="Fuentedeprrafopredeter"/>
     <w:uiPriority w:val="99"/>
     <w:unhideWhenUsed/>
-    <w:rsid w:val="004A5C04"/>
+    <w:rsid w:val="00F72E9A"/>
     <w:rPr>
       <w:color w:val="0563C1" w:themeColor="hyperlink"/>
       <w:u w:val="single"/>

</xml_diff>